<commit_message>
Report: assumptions and potential issues (Section 9)
Lists every modeling and measurement assumption with its potential issue and
how it was checked: 1/weight transform (fractional arc lengths, floating-point
ties, weight-range effects, ordinal trust levels, inferred weight meanings),
signed-network rules, cleaning steps, timing scope, sampling, extrapolation,
memory model, inferred scipy FW skip, single machine. Word file rebuilt.

Co-Authored-By: Claude Opus 5.5 <noreply@anthropic.com>
</commit_message>
<xml_diff>
--- a/computational-study-1-apsp/docs/comparison_report.docx
+++ b/computational-study-1-apsp/docs/comparison_report.docx
@@ -36,7 +36,7 @@
         </w:p>
       </w:sdtContent>
     </w:sdt>
-    <w:bookmarkStart w:id="39" w:name="X6ca6cba28add49a836990d4f169732895bdeef4"/>
+    <w:bookmarkStart w:id="44" w:name="X6ca6cba28add49a836990d4f169732895bdeef4"/>
     <w:p>
       <w:pPr>
         <w:pStyle w:val="Heading1"/>
@@ -869,6 +869,24 @@
       </w:r>
       <w:r>
         <w:t xml:space="preserve">shortest path.</w:t>
+      </w:r>
+    </w:p>
+    <w:p>
+      <w:pPr>
+        <w:pStyle w:val="Compact"/>
+        <w:numPr>
+          <w:ilvl w:val="0"/>
+          <w:numId w:val="1002"/>
+        </w:numPr>
+      </w:pPr>
+      <w:r>
+        <w:t xml:space="preserve">The assumptions behind these choices, and their potential issues (including fractional arc</w:t>
+      </w:r>
+      <w:r>
+        <w:t xml:space="preserve"> </w:t>
+      </w:r>
+      <w:r>
+        <w:t xml:space="preserve">lengths after 1 / weight), are listed in Section 9.</w:t>
       </w:r>
     </w:p>
     <w:bookmarkEnd w:id="11"/>
@@ -5406,13 +5424,1148 @@
       </w:r>
     </w:p>
     <w:bookmarkEnd w:id="37"/>
-    <w:bookmarkStart w:id="38" w:name="X6d7108beb8b862367fe4daa8c6652236ac8ceab"/>
+    <w:bookmarkStart w:id="42" w:name="X411092f1d9ae2af905a4220ede8c839e5a19c28"/>
     <w:p>
       <w:pPr>
         <w:pStyle w:val="Heading2"/>
       </w:pPr>
       <w:r>
-        <w:t xml:space="preserve">9. Limitations</w:t>
+        <w:t xml:space="preserve">9. Assumptions and potential issues</w:t>
+      </w:r>
+    </w:p>
+    <w:p>
+      <w:pPr>
+        <w:pStyle w:val="FirstParagraph"/>
+      </w:pPr>
+      <w:r>
+        <w:t xml:space="preserve">Every modeling and measurement assumption is listed here with what could go wrong and how we checked</w:t>
+      </w:r>
+      <w:r>
+        <w:t xml:space="preserve"> </w:t>
+      </w:r>
+      <w:r>
+        <w:t xml:space="preserve">it. Full reasoning for the data decisions (D1-D6) is in</w:t>
+      </w:r>
+      <w:r>
+        <w:t xml:space="preserve"> </w:t>
+      </w:r>
+      <w:r>
+        <w:rPr>
+          <w:rStyle w:val="VerbatimChar"/>
+        </w:rPr>
+        <w:t xml:space="preserve">docs/decisions.md</w:t>
+      </w:r>
+      <w:r>
+        <w:t xml:space="preserve">.</w:t>
+      </w:r>
+    </w:p>
+    <w:bookmarkStart w:id="38" w:name="X81b7a35303ff1b52bf1581f1c08376172f95005"/>
+    <w:p>
+      <w:pPr>
+        <w:pStyle w:val="Heading3"/>
+      </w:pPr>
+      <w:r>
+        <w:t xml:space="preserve">9.1 Turning strength weights into distances (distance = 1 / weight)</w:t>
+      </w:r>
+    </w:p>
+    <w:p>
+      <w:pPr>
+        <w:pStyle w:val="FirstParagraph"/>
+      </w:pPr>
+      <w:r>
+        <w:t xml:space="preserve">Applies to US Airports (D1), Adolescent Health (D5) and Advogato (D6).</w:t>
+      </w:r>
+    </w:p>
+    <w:tbl>
+      <w:tblPr>
+        <w:tblStyle w:val="Table"/>
+        <w:tblW w:type="auto" w:w="0"/>
+        <w:tblLook w:firstRow="1" w:lastRow="0" w:firstColumn="0" w:lastColumn="0" w:noHBand="0" w:noVBand="0" w:val="0020"/>
+      </w:tblPr>
+      <w:tblGrid>
+        <w:gridCol w:w="2640"/>
+        <w:gridCol w:w="2640"/>
+        <w:gridCol w:w="2640"/>
+      </w:tblGrid>
+      <w:tr>
+        <w:trPr>
+          <w:tblHeader w:val="on"/>
+        </w:trPr>
+        <w:tc>
+          <w:tcPr/>
+          <w:p>
+            <w:pPr>
+              <w:pStyle w:val="Compact"/>
+            </w:pPr>
+            <w:r>
+              <w:t xml:space="preserve">Assumption</w:t>
+            </w:r>
+          </w:p>
+        </w:tc>
+        <w:tc>
+          <w:tcPr/>
+          <w:p>
+            <w:pPr>
+              <w:pStyle w:val="Compact"/>
+            </w:pPr>
+            <w:r>
+              <w:t xml:space="preserve">Potential issue</w:t>
+            </w:r>
+          </w:p>
+        </w:tc>
+        <w:tc>
+          <w:tcPr/>
+          <w:p>
+            <w:pPr>
+              <w:pStyle w:val="Compact"/>
+            </w:pPr>
+            <w:r>
+              <w:t xml:space="preserve">How we checked it / why it is acceptable</w:t>
+            </w:r>
+          </w:p>
+        </w:tc>
+      </w:tr>
+      <w:tr>
+        <w:tc>
+          <w:tcPr/>
+          <w:p>
+            <w:pPr>
+              <w:pStyle w:val="Compact"/>
+            </w:pPr>
+            <w:r>
+              <w:t xml:space="preserve">A stronger tie (more passengers, more shared activities, higher trust) means a shorter distance, and 1 / weight is a sensible way to express that.</w:t>
+            </w:r>
+          </w:p>
+        </w:tc>
+        <w:tc>
+          <w:tcPr/>
+          <w:p>
+            <w:pPr>
+              <w:pStyle w:val="Compact"/>
+            </w:pPr>
+            <w:r>
+              <w:t xml:space="preserve">Other transformations (for example 7 - weight, -log(weight), or ignoring weights) give different shortest paths and different distance values.</w:t>
+            </w:r>
+          </w:p>
+        </w:tc>
+        <w:tc>
+          <w:tcPr/>
+          <w:p>
+            <w:pPr>
+              <w:pStyle w:val="Compact"/>
+            </w:pPr>
+            <w:r>
+              <w:t xml:space="preserve">Standard choice in the literature (Opsahl et al., 2010); alternatives are documented in</w:t>
+            </w:r>
+            <w:r>
+              <w:t xml:space="preserve"> </w:t>
+            </w:r>
+            <w:r>
+              <w:rPr>
+                <w:rStyle w:val="VerbatimChar"/>
+              </w:rPr>
+              <w:t xml:space="preserve">docs/decisions.md</w:t>
+            </w:r>
+            <w:r>
+              <w:t xml:space="preserve">. The</w:t>
+            </w:r>
+            <w:r>
+              <w:t xml:space="preserve"> </w:t>
+            </w:r>
+            <w:r>
+              <w:rPr>
+                <w:b/>
+                <w:bCs/>
+              </w:rPr>
+              <w:t xml:space="preserve">timings do not depend on it</w:t>
+            </w:r>
+            <w:r>
+              <w:t xml:space="preserve">: complexity depends on n and m, not on the edge values. Only the</w:t>
+            </w:r>
+            <w:r>
+              <w:t xml:space="preserve"> </w:t>
+            </w:r>
+            <w:r>
+              <w:rPr>
+                <w:i/>
+                <w:iCs/>
+              </w:rPr>
+              <w:t xml:space="preserve">meaning</w:t>
+            </w:r>
+            <w:r>
+              <w:t xml:space="preserve"> </w:t>
+            </w:r>
+            <w:r>
+              <w:t xml:space="preserve">of the distances does.</w:t>
+            </w:r>
+          </w:p>
+        </w:tc>
+      </w:tr>
+      <w:tr>
+        <w:tc>
+          <w:tcPr/>
+          <w:p>
+            <w:pPr>
+              <w:pStyle w:val="Compact"/>
+            </w:pPr>
+            <w:r>
+              <w:t xml:space="preserve">Arc lengths may be fractions (e.g. 1/3, 1.25, 1/1,489,618).</w:t>
+            </w:r>
+          </w:p>
+        </w:tc>
+        <w:tc>
+          <w:tcPr/>
+          <w:p>
+            <w:pPr>
+              <w:pStyle w:val="Compact"/>
+            </w:pPr>
+            <w:r>
+              <w:t xml:space="preserve">Fractions are stored as 64-bit floating-point numbers, which round in the last digits (about 1 part in 10^16). Two paths that are exactly tied can then compare unequal, so implementations may pick different routes.</w:t>
+            </w:r>
+          </w:p>
+        </w:tc>
+        <w:tc>
+          <w:tcPr/>
+          <w:p>
+            <w:pPr>
+              <w:pStyle w:val="Compact"/>
+            </w:pPr>
+            <w:r>
+              <w:t xml:space="preserve">Neither algorithm needs whole-number lengths, only lengths &gt;= 0. All tests compare with a tolerance. The five versions' mean distances agree to within 2e-15, so rounding never changed a reported result; only the choice between tied routes can differ, never the distance. Methods that require integer lengths (e.g. Dial's bucket algorithm) were not used.</w:t>
+            </w:r>
+          </w:p>
+        </w:tc>
+      </w:tr>
+      <w:tr>
+        <w:tc>
+          <w:tcPr/>
+          <w:p>
+            <w:pPr>
+              <w:pStyle w:val="Compact"/>
+            </w:pPr>
+            <w:r>
+              <w:t xml:space="preserve">The same rule is used for all three strength-weighted networks.</w:t>
+            </w:r>
+          </w:p>
+        </w:tc>
+        <w:tc>
+          <w:tcPr/>
+          <w:p>
+            <w:pPr>
+              <w:pStyle w:val="Compact"/>
+            </w:pPr>
+            <w:r>
+              <w:t xml:space="preserve">How strongly 1 / weight favors detours depends on how spread out the weights are: direct links bypassed by a cheaper multi-step path were 86.9% (US Airports, weights span a million-fold), 8.0% (Adolescent Health, six-fold) and 0% (Advogato, 1.7-fold). Distances therefore mean different things in different datasets.</w:t>
+            </w:r>
+          </w:p>
+        </w:tc>
+        <w:tc>
+          <w:tcPr/>
+          <w:p>
+            <w:pPr>
+              <w:pStyle w:val="Compact"/>
+            </w:pPr>
+            <w:r>
+              <w:t xml:space="preserve">Distances are only compared</w:t>
+            </w:r>
+            <w:r>
+              <w:t xml:space="preserve"> </w:t>
+            </w:r>
+            <w:r>
+              <w:rPr>
+                <w:i/>
+                <w:iCs/>
+              </w:rPr>
+              <w:t xml:space="preserve">within</w:t>
+            </w:r>
+            <w:r>
+              <w:t xml:space="preserve"> </w:t>
+            </w:r>
+            <w:r>
+              <w:t xml:space="preserve">a dataset, never across datasets. The effect is reported in</w:t>
+            </w:r>
+            <w:r>
+              <w:t xml:space="preserve"> </w:t>
+            </w:r>
+            <w:r>
+              <w:rPr>
+                <w:rStyle w:val="VerbatimChar"/>
+              </w:rPr>
+              <w:t xml:space="preserve">docs/decisions.md</w:t>
+            </w:r>
+            <w:r>
+              <w:t xml:space="preserve">.</w:t>
+            </w:r>
+          </w:p>
+        </w:tc>
+      </w:tr>
+      <w:tr>
+        <w:tc>
+          <w:tcPr/>
+          <w:p>
+            <w:pPr>
+              <w:pStyle w:val="Compact"/>
+            </w:pPr>
+            <w:r>
+              <w:t xml:space="preserve">Advogato's trust levels (apprentice, journeyer, master) are treated as the numbers 0.6, 0.8 and 1.0.</w:t>
+            </w:r>
+          </w:p>
+        </w:tc>
+        <w:tc>
+          <w:tcPr/>
+          <w:p>
+            <w:pPr>
+              <w:pStyle w:val="Compact"/>
+            </w:pPr>
+            <w:r>
+              <w:t xml:space="preserve">These are ordered categories, not measured quantities; 1 / level assumes "master" is exactly 1.67 times closer than "apprentice".</w:t>
+            </w:r>
+          </w:p>
+        </w:tc>
+        <w:tc>
+          <w:tcPr/>
+          <w:p>
+            <w:pPr>
+              <w:pStyle w:val="Compact"/>
+            </w:pPr>
+            <w:r>
+              <w:t xml:space="preserve">With these values a direct link is always shortest (2 x 1.00 &gt; 1.67), so the levels only decide between routes with the</w:t>
+            </w:r>
+            <w:r>
+              <w:t xml:space="preserve"> </w:t>
+            </w:r>
+            <w:r>
+              <w:rPr>
+                <w:i/>
+                <w:iCs/>
+              </w:rPr>
+              <w:t xml:space="preserve">same number of steps</w:t>
+            </w:r>
+            <w:r>
+              <w:t xml:space="preserve">. Other numeric values for the levels could change that choice (and the distance values), but not the number of steps on a shortest route, as long as one step always costs less than two.</w:t>
+            </w:r>
+          </w:p>
+        </w:tc>
+      </w:tr>
+      <w:tr>
+        <w:tc>
+          <w:tcPr/>
+          <w:p>
+            <w:pPr>
+              <w:pStyle w:val="Compact"/>
+            </w:pPr>
+            <w:r>
+              <w:t xml:space="preserve">US Airports weight = passengers on the route in 2010.</w:t>
+            </w:r>
+          </w:p>
+        </w:tc>
+        <w:tc>
+          <w:tcPr/>
+          <w:p>
+            <w:pPr>
+              <w:pStyle w:val="Compact"/>
+            </w:pPr>
+            <w:r>
+              <w:t xml:space="preserve">KONECT's README says "number of flights"; if that were right, distances would change.</w:t>
+            </w:r>
+          </w:p>
+        </w:tc>
+        <w:tc>
+          <w:tcPr/>
+          <w:p>
+            <w:pPr>
+              <w:pStyle w:val="Compact"/>
+            </w:pPr>
+            <w:r>
+              <w:t xml:space="preserve">The original source (Opsahl; BTS T-100) says passengers, and the totals match real 2010 airport traffic (e.g. ATL 43.0 million). Timings are unaffected either way.</w:t>
+            </w:r>
+          </w:p>
+        </w:tc>
+      </w:tr>
+      <w:tr>
+        <w:tc>
+          <w:tcPr/>
+          <w:p>
+            <w:pPr>
+              <w:pStyle w:val="Compact"/>
+            </w:pPr>
+            <w:r>
+              <w:t xml:space="preserve">Adolescent Health weight = 1 + number of shared activities (1..6).</w:t>
+            </w:r>
+          </w:p>
+        </w:tc>
+        <w:tc>
+          <w:tcPr/>
+          <w:p>
+            <w:pPr>
+              <w:pStyle w:val="Compact"/>
+            </w:pPr>
+            <w:r>
+              <w:t xml:space="preserve">The mapping is inferred: KONECT's README sentence on it is garbled. A different increasing mapping would change the distances.</w:t>
+            </w:r>
+          </w:p>
+        </w:tc>
+        <w:tc>
+          <w:tcPr/>
+          <w:p>
+            <w:pPr>
+              <w:pStyle w:val="Compact"/>
+            </w:pPr>
+            <w:r>
+              <w:t xml:space="preserve">The 1..6 range and the five activities are confirmed by a secondary source (arXiv:0912.0161); "1 + count" is the only mapping consistent with both. Timings are unaffected.</w:t>
+            </w:r>
+          </w:p>
+        </w:tc>
+      </w:tr>
+      <w:tr>
+        <w:tc>
+          <w:tcPr/>
+          <w:p>
+            <w:pPr>
+              <w:pStyle w:val="Compact"/>
+            </w:pPr>
+            <w:r>
+              <w:t xml:space="preserve">Every weight is strictly positive.</w:t>
+            </w:r>
+          </w:p>
+        </w:tc>
+        <w:tc>
+          <w:tcPr/>
+          <w:p>
+            <w:pPr>
+              <w:pStyle w:val="Compact"/>
+            </w:pPr>
+            <w:r>
+              <w:t xml:space="preserve">1 / 0 would be infinite (equivalent to no edge).</w:t>
+            </w:r>
+          </w:p>
+        </w:tc>
+        <w:tc>
+          <w:tcPr/>
+          <w:p>
+            <w:pPr>
+              <w:pStyle w:val="Compact"/>
+            </w:pPr>
+            <w:r>
+              <w:t xml:space="preserve">Checked in code (</w:t>
+            </w:r>
+            <w:r>
+              <w:rPr>
+                <w:rStyle w:val="VerbatimChar"/>
+              </w:rPr>
+              <w:t xml:space="preserve">inverse_weights</w:t>
+            </w:r>
+            <w:r>
+              <w:t xml:space="preserve"> </w:t>
+            </w:r>
+            <w:r>
+              <w:t xml:space="preserve">refuses zero or negative weights); none occur in the three datasets.</w:t>
+            </w:r>
+          </w:p>
+        </w:tc>
+      </w:tr>
+    </w:tbl>
+    <w:bookmarkEnd w:id="38"/>
+    <w:bookmarkStart w:id="39" w:name="X0188deefee49dd268dfaf7fa454e764e8064da7"/>
+    <w:p>
+      <w:pPr>
+        <w:pStyle w:val="Heading3"/>
+      </w:pPr>
+      <w:r>
+        <w:t xml:space="preserve">9.2 Signed networks</w:t>
+      </w:r>
+    </w:p>
+    <w:tbl>
+      <w:tblPr>
+        <w:tblStyle w:val="Table"/>
+        <w:tblW w:type="auto" w:w="0"/>
+        <w:tblLook w:firstRow="1" w:lastRow="0" w:firstColumn="0" w:lastColumn="0" w:noHBand="0" w:noVBand="0" w:val="0020"/>
+      </w:tblPr>
+      <w:tblGrid>
+        <w:gridCol w:w="2640"/>
+        <w:gridCol w:w="2640"/>
+        <w:gridCol w:w="2640"/>
+      </w:tblGrid>
+      <w:tr>
+        <w:trPr>
+          <w:tblHeader w:val="on"/>
+        </w:trPr>
+        <w:tc>
+          <w:tcPr/>
+          <w:p>
+            <w:pPr>
+              <w:pStyle w:val="Compact"/>
+            </w:pPr>
+            <w:r>
+              <w:t xml:space="preserve">Assumption</w:t>
+            </w:r>
+          </w:p>
+        </w:tc>
+        <w:tc>
+          <w:tcPr/>
+          <w:p>
+            <w:pPr>
+              <w:pStyle w:val="Compact"/>
+            </w:pPr>
+            <w:r>
+              <w:t xml:space="preserve">Potential issue</w:t>
+            </w:r>
+          </w:p>
+        </w:tc>
+        <w:tc>
+          <w:tcPr/>
+          <w:p>
+            <w:pPr>
+              <w:pStyle w:val="Compact"/>
+            </w:pPr>
+            <w:r>
+              <w:t xml:space="preserve">How we checked it / why it is acceptable</w:t>
+            </w:r>
+          </w:p>
+        </w:tc>
+      </w:tr>
+      <w:tr>
+        <w:tc>
+          <w:tcPr/>
+          <w:p>
+            <w:pPr>
+              <w:pStyle w:val="Compact"/>
+            </w:pPr>
+            <w:r>
+              <w:t xml:space="preserve">Signed weights cannot be distances.</w:t>
+            </w:r>
+          </w:p>
+        </w:tc>
+        <w:tc>
+          <w:tcPr/>
+          <w:p>
+            <w:pPr>
+              <w:pStyle w:val="Compact"/>
+            </w:pPr>
+            <w:r>
+              <w:t xml:space="preserve">The sign and size of interactions are not used in the distances.</w:t>
+            </w:r>
+          </w:p>
+        </w:tc>
+        <w:tc>
+          <w:tcPr/>
+          <w:p>
+            <w:pPr>
+              <w:pStyle w:val="Compact"/>
+            </w:pPr>
+            <w:r>
+              <w:t xml:space="preserve">Both networks contain negative cycles (Slashdot: 4,497 mutual-foe pairs; Wiki Conflict: every negative edge, since it is undirected), so shortest paths are undefined for any algorithm with the raw weights. Hop counts are the honest alternative (D2, D4).</w:t>
+            </w:r>
+          </w:p>
+        </w:tc>
+      </w:tr>
+      <w:tr>
+        <w:tc>
+          <w:tcPr/>
+          <w:p>
+            <w:pPr>
+              <w:pStyle w:val="Compact"/>
+            </w:pPr>
+            <w:r>
+              <w:t xml:space="preserve">Slashdot keeps friend tags only; Wiki Conflict keeps all interactions.</w:t>
+            </w:r>
+          </w:p>
+        </w:tc>
+        <w:tc>
+          <w:tcPr/>
+          <w:p>
+            <w:pPr>
+              <w:pStyle w:val="Compact"/>
+            </w:pPr>
+            <w:r>
+              <w:t xml:space="preserve">The two signed networks follow different rules, so their distances mean different things.</w:t>
+            </w:r>
+          </w:p>
+        </w:tc>
+        <w:tc>
+          <w:tcPr/>
+          <w:p>
+            <w:pPr>
+              <w:pStyle w:val="Compact"/>
+            </w:pPr>
+            <w:r>
+              <w:t xml:space="preserve">Deliberate (D2 vs D4): on Slashdot the sign defines the relationship itself (friend vs foe); on Wiki Conflict both signs show that two editors worked on the same text.</w:t>
+            </w:r>
+          </w:p>
+        </w:tc>
+      </w:tr>
+      <w:tr>
+        <w:tc>
+          <w:tcPr/>
+          <w:p>
+            <w:pPr>
+              <w:pStyle w:val="Compact"/>
+            </w:pPr>
+            <w:r>
+              <w:t xml:space="preserve">All edges have length 1 (hop counts).</w:t>
+            </w:r>
+          </w:p>
+        </w:tc>
+        <w:tc>
+          <w:tcPr/>
+          <w:p>
+            <w:pPr>
+              <w:pStyle w:val="Compact"/>
+            </w:pPr>
+            <w:r>
+              <w:t xml:space="preserve">Breadth-first search would solve these faster than Dijkstra.</w:t>
+            </w:r>
+          </w:p>
+        </w:tc>
+        <w:tc>
+          <w:tcPr/>
+          <w:p>
+            <w:pPr>
+              <w:pStyle w:val="Compact"/>
+            </w:pPr>
+            <w:r>
+              <w:t xml:space="preserve">Stated as an algorithm variant (Section 3.1); Dijkstra is timed anyway to compare like with like.</w:t>
+            </w:r>
+          </w:p>
+        </w:tc>
+      </w:tr>
+    </w:tbl>
+    <w:bookmarkEnd w:id="39"/>
+    <w:bookmarkStart w:id="40" w:name="X63aee14dd9158d851da6ad1378e6d0f232836b1"/>
+    <w:p>
+      <w:pPr>
+        <w:pStyle w:val="Heading3"/>
+      </w:pPr>
+      <w:r>
+        <w:t xml:space="preserve">9.3 Cleaning the networks</w:t>
+      </w:r>
+    </w:p>
+    <w:tbl>
+      <w:tblPr>
+        <w:tblStyle w:val="Table"/>
+        <w:tblW w:type="auto" w:w="0"/>
+        <w:tblLook w:firstRow="1" w:lastRow="0" w:firstColumn="0" w:lastColumn="0" w:noHBand="0" w:noVBand="0" w:val="0020"/>
+      </w:tblPr>
+      <w:tblGrid>
+        <w:gridCol w:w="2640"/>
+        <w:gridCol w:w="2640"/>
+        <w:gridCol w:w="2640"/>
+      </w:tblGrid>
+      <w:tr>
+        <w:trPr>
+          <w:tblHeader w:val="on"/>
+        </w:trPr>
+        <w:tc>
+          <w:tcPr/>
+          <w:p>
+            <w:pPr>
+              <w:pStyle w:val="Compact"/>
+            </w:pPr>
+            <w:r>
+              <w:t xml:space="preserve">Assumption</w:t>
+            </w:r>
+          </w:p>
+        </w:tc>
+        <w:tc>
+          <w:tcPr/>
+          <w:p>
+            <w:pPr>
+              <w:pStyle w:val="Compact"/>
+            </w:pPr>
+            <w:r>
+              <w:t xml:space="preserve">Potential issue</w:t>
+            </w:r>
+          </w:p>
+        </w:tc>
+        <w:tc>
+          <w:tcPr/>
+          <w:p>
+            <w:pPr>
+              <w:pStyle w:val="Compact"/>
+            </w:pPr>
+            <w:r>
+              <w:t xml:space="preserve">How we checked it / why it is acceptable</w:t>
+            </w:r>
+          </w:p>
+        </w:tc>
+      </w:tr>
+      <w:tr>
+        <w:tc>
+          <w:tcPr/>
+          <w:p>
+            <w:pPr>
+              <w:pStyle w:val="Compact"/>
+            </w:pPr>
+            <w:r>
+              <w:t xml:space="preserve">Nodes with no links are dropped.</w:t>
+            </w:r>
+          </w:p>
+        </w:tc>
+        <w:tc>
+          <w:tcPr/>
+          <w:p>
+            <w:pPr>
+              <w:pStyle w:val="Compact"/>
+            </w:pPr>
+            <w:r>
+              <w:t xml:space="preserve">n differs from the published counts: Advogato 6,541 -&gt; 5,155, Slashdot 79,120 -&gt; 69,995, Wiki Conflict 118,100 -&gt; 116,836.</w:t>
+            </w:r>
+          </w:p>
+        </w:tc>
+        <w:tc>
+          <w:tcPr/>
+          <w:p>
+            <w:pPr>
+              <w:pStyle w:val="Compact"/>
+            </w:pPr>
+            <w:r>
+              <w:t xml:space="preserve">Such nodes can neither reach nor be reached, so they add only empty rows. Keeping them would make FW's table</w:t>
+            </w:r>
+            <w:r>
+              <w:t xml:space="preserve"> </w:t>
+            </w:r>
+            <w:r>
+              <w:rPr>
+                <w:i/>
+                <w:iCs/>
+              </w:rPr>
+              <w:t xml:space="preserve">larger</w:t>
+            </w:r>
+            <w:r>
+              <w:t xml:space="preserve">, which strengthens the infeasibility conclusions rather than weakening them. Both counts are reported (Section 2).</w:t>
+            </w:r>
+          </w:p>
+        </w:tc>
+      </w:tr>
+      <w:tr>
+        <w:tc>
+          <w:tcPr/>
+          <w:p>
+            <w:pPr>
+              <w:pStyle w:val="Compact"/>
+            </w:pPr>
+            <w:r>
+              <w:t xml:space="preserve">Self-loops (Advogato) and repeated edges (Wiki Conflict) are removed.</w:t>
+            </w:r>
+          </w:p>
+        </w:tc>
+        <w:tc>
+          <w:tcPr/>
+          <w:p>
+            <w:pPr>
+              <w:pStyle w:val="Compact"/>
+            </w:pPr>
+            <w:r>
+              <w:t xml:space="preserve">m differs from the raw row counts.</w:t>
+            </w:r>
+          </w:p>
+        </w:tc>
+        <w:tc>
+          <w:tcPr/>
+          <w:p>
+            <w:pPr>
+              <w:pStyle w:val="Compact"/>
+            </w:pPr>
+            <w:r>
+              <w:t xml:space="preserve">A self-loop or a duplicate can never shorten a path. Duplicates are removed before building sparse matrices because scipy would otherwise</w:t>
+            </w:r>
+            <w:r>
+              <w:t xml:space="preserve"> </w:t>
+            </w:r>
+            <w:r>
+              <w:rPr>
+                <w:i/>
+                <w:iCs/>
+              </w:rPr>
+              <w:t xml:space="preserve">add</w:t>
+            </w:r>
+            <w:r>
+              <w:t xml:space="preserve"> </w:t>
+            </w:r>
+            <w:r>
+              <w:t xml:space="preserve">them together.</w:t>
+            </w:r>
+          </w:p>
+        </w:tc>
+      </w:tr>
+      <w:tr>
+        <w:tc>
+          <w:tcPr/>
+          <w:p>
+            <w:pPr>
+              <w:pStyle w:val="Compact"/>
+            </w:pPr>
+            <w:r>
+              <w:t xml:space="preserve">Wiki Conflict (undirected) is stored as two one-way edges per pair.</w:t>
+            </w:r>
+          </w:p>
+        </w:tc>
+        <w:tc>
+          <w:tcPr/>
+          <w:p>
+            <w:pPr>
+              <w:pStyle w:val="Compact"/>
+            </w:pPr>
+            <w:r>
+              <w:t xml:space="preserve">m = 4,055,742, twice the number of editor pairs.</w:t>
+            </w:r>
+          </w:p>
+        </w:tc>
+        <w:tc>
+          <w:tcPr/>
+          <w:p>
+            <w:pPr>
+              <w:pStyle w:val="Compact"/>
+            </w:pPr>
+            <w:r>
+              <w:t xml:space="preserve">That is what the algorithms actually scan, so it is the right m for the complexity formulas.</w:t>
+            </w:r>
+          </w:p>
+        </w:tc>
+      </w:tr>
+      <w:tr>
+        <w:tc>
+          <w:tcPr/>
+          <w:p>
+            <w:pPr>
+              <w:pStyle w:val="Compact"/>
+            </w:pPr>
+            <w:r>
+              <w:t xml:space="preserve">The data files are correct.</w:t>
+            </w:r>
+          </w:p>
+        </w:tc>
+        <w:tc>
+          <w:tcPr/>
+          <w:p>
+            <w:pPr>
+              <w:pStyle w:val="Compact"/>
+            </w:pPr>
+            <w:r>
+              <w:t xml:space="preserve">Two unexplained discrepancies: the Wiki Conflict file header claims 2,985,759 edges (the file and KONECT's website have 2,917,785), and we count 2,027,871 distinct editor pairs where KONECT reports 2,014,062.</w:t>
+            </w:r>
+          </w:p>
+        </w:tc>
+        <w:tc>
+          <w:tcPr/>
+          <w:p>
+            <w:pPr>
+              <w:pStyle w:val="Compact"/>
+            </w:pPr>
+            <w:r>
+              <w:t xml:space="preserve">Recorded in</w:t>
+            </w:r>
+            <w:r>
+              <w:t xml:space="preserve"> </w:t>
+            </w:r>
+            <w:r>
+              <w:rPr>
+                <w:rStyle w:val="VerbatimChar"/>
+              </w:rPr>
+              <w:t xml:space="preserve">data/SOURCES.md</w:t>
+            </w:r>
+            <w:r>
+              <w:t xml:space="preserve">; every file is pinned by a SHA-256 checksum, so the results are reproducible from the exact data used.</w:t>
+            </w:r>
+          </w:p>
+        </w:tc>
+      </w:tr>
+    </w:tbl>
+    <w:bookmarkEnd w:id="40"/>
+    <w:bookmarkStart w:id="41" w:name="Xa4e3bf44c89c34c744407e922f3c9b44d7f2168"/>
+    <w:p>
+      <w:pPr>
+        <w:pStyle w:val="Heading3"/>
+      </w:pPr>
+      <w:r>
+        <w:t xml:space="preserve">9.4 Measurement</w:t>
+      </w:r>
+    </w:p>
+    <w:tbl>
+      <w:tblPr>
+        <w:tblStyle w:val="Table"/>
+        <w:tblW w:type="auto" w:w="0"/>
+        <w:tblLook w:firstRow="1" w:lastRow="0" w:firstColumn="0" w:lastColumn="0" w:noHBand="0" w:noVBand="0" w:val="0020"/>
+      </w:tblPr>
+      <w:tblGrid>
+        <w:gridCol w:w="2640"/>
+        <w:gridCol w:w="2640"/>
+        <w:gridCol w:w="2640"/>
+      </w:tblGrid>
+      <w:tr>
+        <w:trPr>
+          <w:tblHeader w:val="on"/>
+        </w:trPr>
+        <w:tc>
+          <w:tcPr/>
+          <w:p>
+            <w:pPr>
+              <w:pStyle w:val="Compact"/>
+            </w:pPr>
+            <w:r>
+              <w:t xml:space="preserve">Assumption</w:t>
+            </w:r>
+          </w:p>
+        </w:tc>
+        <w:tc>
+          <w:tcPr/>
+          <w:p>
+            <w:pPr>
+              <w:pStyle w:val="Compact"/>
+            </w:pPr>
+            <w:r>
+              <w:t xml:space="preserve">Potential issue</w:t>
+            </w:r>
+          </w:p>
+        </w:tc>
+        <w:tc>
+          <w:tcPr/>
+          <w:p>
+            <w:pPr>
+              <w:pStyle w:val="Compact"/>
+            </w:pPr>
+            <w:r>
+              <w:t xml:space="preserve">How we checked it / why it is acceptable</w:t>
+            </w:r>
+          </w:p>
+        </w:tc>
+      </w:tr>
+      <w:tr>
+        <w:tc>
+          <w:tcPr/>
+          <w:p>
+            <w:pPr>
+              <w:pStyle w:val="Compact"/>
+            </w:pPr>
+            <w:r>
+              <w:t xml:space="preserve">Timing covers the shortest-path computation only.</w:t>
+            </w:r>
+          </w:p>
+        </w:tc>
+        <w:tc>
+          <w:tcPr/>
+          <w:p>
+            <w:pPr>
+              <w:pStyle w:val="Compact"/>
+            </w:pPr>
+            <w:r>
+              <w:t xml:space="preserve">Loading data and building the input (which take seconds to a minute on the large networks) are excluded.</w:t>
+            </w:r>
+          </w:p>
+        </w:tc>
+        <w:tc>
+          <w:tcPr/>
+          <w:p>
+            <w:pPr>
+              <w:pStyle w:val="Compact"/>
+            </w:pPr>
+            <w:r>
+              <w:t xml:space="preserve">Applied identically to every version. scipy's FW includes a sparse-to-dense conversion inside its call; it is O(n^2) and negligible next to n^3.</w:t>
+            </w:r>
+          </w:p>
+        </w:tc>
+      </w:tr>
+      <w:tr>
+        <w:tc>
+          <w:tcPr/>
+          <w:p>
+            <w:pPr>
+              <w:pStyle w:val="Compact"/>
+            </w:pPr>
+            <w:r>
+              <w:t xml:space="preserve">Our pure Dijkstra on Wiki Conflict is estimated from 1,000 random sources (time x n / 1,000).</w:t>
+            </w:r>
+          </w:p>
+        </w:tc>
+        <w:tc>
+          <w:tcPr/>
+          <w:p>
+            <w:pPr>
+              <w:pStyle w:val="Compact"/>
+            </w:pPr>
+            <w:r>
+              <w:t xml:space="preserve">The sampled sources might not be typical.</w:t>
+            </w:r>
+          </w:p>
+        </w:tc>
+        <w:tc>
+          <w:tcPr/>
+          <w:p>
+            <w:pPr>
+              <w:pStyle w:val="Compact"/>
+            </w:pPr>
+            <w:r>
+              <w:t xml:space="preserve">The sample's reachable share (93.1%) and mean distance (3.330) are close to the full scipy run's (93.8%, 3.322), so the sample is representative to within a few percent.</w:t>
+            </w:r>
+          </w:p>
+        </w:tc>
+      </w:tr>
+      <w:tr>
+        <w:tc>
+          <w:tcPr/>
+          <w:p>
+            <w:pPr>
+              <w:pStyle w:val="Compact"/>
+            </w:pPr>
+            <w:r>
+              <w:t xml:space="preserve">FW times for the infeasible runs are extrapolated from Advogato.</w:t>
+            </w:r>
+          </w:p>
+        </w:tc>
+        <w:tc>
+          <w:tcPr/>
+          <w:p>
+            <w:pPr>
+              <w:pStyle w:val="Compact"/>
+            </w:pPr>
+            <w:r>
+              <w:t xml:space="preserve">Prediction error.</w:t>
+            </w:r>
+          </w:p>
+        </w:tc>
+        <w:tc>
+          <w:tcPr/>
+          <w:p>
+            <w:pPr>
+              <w:pStyle w:val="Compact"/>
+            </w:pPr>
+            <w:r>
+              <w:t xml:space="preserve">Two models give a range (21.5 h vs 12.8 h; 4 vs 6 days). The n^3 model predicted the other measured FW runs to within 0.96x-1.41x. The conclusion (hours to days) does not depend on which model is used.</w:t>
+            </w:r>
+          </w:p>
+        </w:tc>
+      </w:tr>
+      <w:tr>
+        <w:tc>
+          <w:tcPr/>
+          <w:p>
+            <w:pPr>
+              <w:pStyle w:val="Compact"/>
+            </w:pPr>
+            <w:r>
+              <w:t xml:space="preserve">A run is infeasible if its memory estimate exceeds 60% of RAM (8 bytes per table cell in scipy, 16 in numpy, up to 32 in pure Python).</w:t>
+            </w:r>
+          </w:p>
+        </w:tc>
+        <w:tc>
+          <w:tcPr/>
+          <w:p>
+            <w:pPr>
+              <w:pStyle w:val="Compact"/>
+            </w:pPr>
+            <w:r>
+              <w:t xml:space="preserve">The memory model could be wrong.</w:t>
+            </w:r>
+          </w:p>
+        </w:tc>
+        <w:tc>
+          <w:tcPr/>
+          <w:p>
+            <w:pPr>
+              <w:pStyle w:val="Compact"/>
+            </w:pPr>
+            <w:r>
+              <w:t xml:space="preserve">On Advogato, scipy FW's measured memory increase (346 MiB) was about 1.7 times the table size (203 MiB), so the model</w:t>
+            </w:r>
+            <w:r>
+              <w:t xml:space="preserve"> </w:t>
+            </w:r>
+            <w:r>
+              <w:rPr>
+                <w:i/>
+                <w:iCs/>
+              </w:rPr>
+              <w:t xml:space="preserve">underestimates</w:t>
+            </w:r>
+            <w:r>
+              <w:t xml:space="preserve"> </w:t>
+            </w:r>
+            <w:r>
+              <w:t xml:space="preserve">memory: the real requirement for the large networks is even higher than stated.</w:t>
+            </w:r>
+          </w:p>
+        </w:tc>
+      </w:tr>
+      <w:tr>
+        <w:tc>
+          <w:tcPr/>
+          <w:p>
+            <w:pPr>
+              <w:pStyle w:val="Compact"/>
+            </w:pPr>
+            <w:r>
+              <w:t xml:space="preserve">scipy's FW skips pairs (i, k) where i cannot reach k.</w:t>
+            </w:r>
+          </w:p>
+        </w:tc>
+        <w:tc>
+          <w:tcPr/>
+          <w:p>
+            <w:pPr>
+              <w:pStyle w:val="Compact"/>
+            </w:pPr>
+            <w:r>
+              <w:t xml:space="preserve">We inferred this from measurements, not from scipy's source code.</w:t>
+            </w:r>
+          </w:p>
+        </w:tc>
+        <w:tc>
+          <w:tcPr/>
+          <w:p>
+            <w:pPr>
+              <w:pStyle w:val="Compact"/>
+            </w:pPr>
+            <w:r>
+              <w:t xml:space="preserve">The evidence is strong: on random networks with n = 1,000 its time ranged from 0.005 s to about 0.46 s depending on density, which is impossible for a fixed n^3 loop.</w:t>
+            </w:r>
+          </w:p>
+        </w:tc>
+      </w:tr>
+      <w:tr>
+        <w:tc>
+          <w:tcPr/>
+          <w:p>
+            <w:pPr>
+              <w:pStyle w:val="Compact"/>
+            </w:pPr>
+            <w:r>
+              <w:t xml:space="preserve">One machine, single thread. Long runs (over 10 s) were measured once.</w:t>
+            </w:r>
+          </w:p>
+        </w:tc>
+        <w:tc>
+          <w:tcPr/>
+          <w:p>
+            <w:pPr>
+              <w:pStyle w:val="Compact"/>
+            </w:pPr>
+            <w:r>
+              <w:t xml:space="preserve">Absolute times would differ on other hardware; single long runs carry some timing noise.</w:t>
+            </w:r>
+          </w:p>
+        </w:tc>
+        <w:tc>
+          <w:tcPr/>
+          <w:p>
+            <w:pPr>
+              <w:pStyle w:val="Compact"/>
+            </w:pPr>
+            <w:r>
+              <w:t xml:space="preserve">Ratios and complexity arguments do not depend on the machine. For short runs measured five times, the spread (slowest minus fastest, relative to the median) was 4% at the median and 12% at most, far smaller than the differences between algorithms (3x to 170x).</w:t>
+            </w:r>
+          </w:p>
+        </w:tc>
+      </w:tr>
+    </w:tbl>
+    <w:bookmarkEnd w:id="41"/>
+    <w:bookmarkEnd w:id="42"/>
+    <w:bookmarkStart w:id="43" w:name="X57d56956c0b631bb6a0ea7bd9242c6129e94934"/>
+    <w:p>
+      <w:pPr>
+        <w:pStyle w:val="Heading2"/>
+      </w:pPr>
+      <w:r>
+        <w:t xml:space="preserve">10. Limitations</w:t>
       </w:r>
     </w:p>
     <w:p>
@@ -5491,8 +6644,8 @@
         <w:t xml:space="preserve">the ratios and the complexity arguments do not depend on the machine.</w:t>
       </w:r>
     </w:p>
-    <w:bookmarkEnd w:id="38"/>
-    <w:bookmarkEnd w:id="39"/>
+    <w:bookmarkEnd w:id="43"/>
+    <w:bookmarkEnd w:id="44"/>
     <w:sectPr>
       <w:footnotePr>
         <w:numRestart w:val="eachSect"/>

</xml_diff>

<commit_message>
Review pass: fix report details, add GitHub link, complexity table, references
Report: GitHub link and clone command; complexity overview (3.0); references
(11); 18-24x (not 20x) denser; 2.7 PB (not 2.5); FW flat from 1-2% density;
memory-model row corrected (excess comes from our summary step, not scipy);
note that numpy/pure FW 'infeasible' on large networks is by the same memory
check; 'tier' jargon removed. Word: report heading becomes the document title.
Code/notes: stale future-tense comments updated; CLAUDE.md timing rule and
Phase 4 status made accurate.

Co-Authored-By: Claude Opus 5.5 <noreply@anthropic.com>
</commit_message>
<xml_diff>
--- a/computational-study-1-apsp/docs/comparison_report.docx
+++ b/computational-study-1-apsp/docs/comparison_report.docx
@@ -7,7 +7,7 @@
         <w:pStyle w:val="Title"/>
       </w:pPr>
       <w:r>
-        <w:t xml:space="preserve">Computational Study 1: All-Pairs Shortest Paths</w:t>
+        <w:t xml:space="preserve">All-pairs shortest paths: n x Dijkstra vs Floyd-Warshall on five real networks</w:t>
       </w:r>
     </w:p>
     <w:sdt>
@@ -36,27 +36,41 @@
         </w:p>
       </w:sdtContent>
     </w:sdt>
-    <w:bookmarkStart w:id="44" w:name="X6ca6cba28add49a836990d4f169732895bdeef4"/>
+    <w:p>
+      <w:pPr>
+        <w:pStyle w:val="FirstParagraph"/>
+      </w:pPr>
+      <w:r>
+        <w:t xml:space="preserve">MMIE 7372, Network Flows: Computational Study 1.</w:t>
+      </w:r>
+    </w:p>
+    <w:p>
+      <w:pPr>
+        <w:pStyle w:val="BodyText"/>
+      </w:pPr>
+      <w:r>
+        <w:rPr>
+          <w:b/>
+          <w:bCs/>
+        </w:rPr>
+        <w:t xml:space="preserve">Code, data sources and all results:</w:t>
+      </w:r>
+      <w:r>
+        <w:t xml:space="preserve"> </w:t>
+      </w:r>
+      <w:hyperlink r:id="rId9">
+        <w:r>
+          <w:rPr>
+            <w:rStyle w:val="Hyperlink"/>
+          </w:rPr>
+          <w:t xml:space="preserve">https://github.com/absharotry/mmie.7372.001.NetFlow-DyProg.fall26/tree/main/computational-study-1-apsp</w:t>
+        </w:r>
+      </w:hyperlink>
+    </w:p>
+    <w:bookmarkStart w:id="10" w:name="X54a346158e1c9302d737b408239f1b33007b474"/>
     <w:p>
       <w:pPr>
         <w:pStyle w:val="Heading1"/>
-      </w:pPr>
-      <w:r>
-        <w:t xml:space="preserve">All-pairs shortest paths: n x Dijkstra vs Floyd-Warshall on five real networks</w:t>
-      </w:r>
-    </w:p>
-    <w:p>
-      <w:pPr>
-        <w:pStyle w:val="FirstParagraph"/>
-      </w:pPr>
-      <w:r>
-        <w:t xml:space="preserve">MMIE 7372, Network Flows: Computational Study 1.</w:t>
-      </w:r>
-    </w:p>
-    <w:bookmarkStart w:id="9" w:name="X54a346158e1c9302d737b408239f1b33007b474"/>
-    <w:p>
-      <w:pPr>
-        <w:pStyle w:val="Heading2"/>
       </w:pPr>
       <w:r>
         <w:t xml:space="preserve">1. Summary</w:t>
@@ -255,13 +269,13 @@
         <w:t xml:space="preserve">21-27% density</w:t>
       </w:r>
       <w:r>
-        <w:t xml:space="preserve">. That is 20 times denser</w:t>
-      </w:r>
-      <w:r>
-        <w:t xml:space="preserve"> </w:t>
-      </w:r>
-      <w:r>
-        <w:t xml:space="preserve">than the densest real network studied. In pure Python the crossover is at about</w:t>
+        <w:t xml:space="preserve">. That is about 18-24 times</w:t>
+      </w:r>
+      <w:r>
+        <w:t xml:space="preserve"> </w:t>
+      </w:r>
+      <w:r>
+        <w:t xml:space="preserve">denser than the densest real network studied (1.1%). In pure Python the crossover is at about</w:t>
       </w:r>
       <w:r>
         <w:t xml:space="preserve"> </w:t>
@@ -305,73 +319,73 @@
         <w:t xml:space="preserve">slower in scipy and 35x slower in pure Python on the same network.</w:t>
       </w:r>
     </w:p>
-    <w:bookmarkEnd w:id="9"/>
-    <w:bookmarkStart w:id="13" w:name="X176e0f5d4b452186e08e3a166074021d343e071"/>
+    <w:bookmarkEnd w:id="10"/>
+    <w:bookmarkStart w:id="14" w:name="X176e0f5d4b452186e08e3a166074021d343e071"/>
+    <w:p>
+      <w:pPr>
+        <w:pStyle w:val="Heading1"/>
+      </w:pPr>
+      <w:r>
+        <w:t xml:space="preserve">2. Datasets and network characteristics</w:t>
+      </w:r>
+    </w:p>
+    <w:p>
+      <w:pPr>
+        <w:pStyle w:val="FirstParagraph"/>
+      </w:pPr>
+      <w:r>
+        <w:t xml:space="preserve">Raw data came from the sources named in the assignment (KONECT, Netzschleuder, Canvas). Download</w:t>
+      </w:r>
+      <w:r>
+        <w:t xml:space="preserve"> </w:t>
+      </w:r>
+      <w:r>
+        <w:t xml:space="preserve">URLs and SHA-256 checksums are in</w:t>
+      </w:r>
+      <w:r>
+        <w:t xml:space="preserve"> </w:t>
+      </w:r>
+      <w:r>
+        <w:rPr>
+          <w:rStyle w:val="VerbatimChar"/>
+        </w:rPr>
+        <w:t xml:space="preserve">data/SOURCES.md</w:t>
+      </w:r>
+      <w:r>
+        <w:t xml:space="preserve">. Each dataset needed decisions about what an</w:t>
+      </w:r>
+      <w:r>
+        <w:t xml:space="preserve"> </w:t>
+      </w:r>
+      <w:r>
+        <w:t xml:space="preserve">edge weight means as a distance; these are documented in</w:t>
+      </w:r>
+      <w:r>
+        <w:t xml:space="preserve"> </w:t>
+      </w:r>
+      <w:r>
+        <w:rPr>
+          <w:rStyle w:val="VerbatimChar"/>
+        </w:rPr>
+        <w:t xml:space="preserve">docs/decisions.md</w:t>
+      </w:r>
+      <w:r>
+        <w:t xml:space="preserve"> </w:t>
+      </w:r>
+      <w:r>
+        <w:t xml:space="preserve">(D1-D6) and summarized</w:t>
+      </w:r>
+      <w:r>
+        <w:t xml:space="preserve"> </w:t>
+      </w:r>
+      <w:r>
+        <w:t xml:space="preserve">here.</w:t>
+      </w:r>
+    </w:p>
+    <w:bookmarkStart w:id="11" w:name="Xde03563cf80caecc49d916aa684dfe68c08826a"/>
     <w:p>
       <w:pPr>
         <w:pStyle w:val="Heading2"/>
-      </w:pPr>
-      <w:r>
-        <w:t xml:space="preserve">2. Datasets and network characteristics</w:t>
-      </w:r>
-    </w:p>
-    <w:p>
-      <w:pPr>
-        <w:pStyle w:val="FirstParagraph"/>
-      </w:pPr>
-      <w:r>
-        <w:t xml:space="preserve">Raw data came from the sources named in the assignment (KONECT, Netzschleuder, Canvas). Download</w:t>
-      </w:r>
-      <w:r>
-        <w:t xml:space="preserve"> </w:t>
-      </w:r>
-      <w:r>
-        <w:t xml:space="preserve">URLs and SHA-256 checksums are in</w:t>
-      </w:r>
-      <w:r>
-        <w:t xml:space="preserve"> </w:t>
-      </w:r>
-      <w:r>
-        <w:rPr>
-          <w:rStyle w:val="VerbatimChar"/>
-        </w:rPr>
-        <w:t xml:space="preserve">data/SOURCES.md</w:t>
-      </w:r>
-      <w:r>
-        <w:t xml:space="preserve">. Each dataset needed decisions about what an</w:t>
-      </w:r>
-      <w:r>
-        <w:t xml:space="preserve"> </w:t>
-      </w:r>
-      <w:r>
-        <w:t xml:space="preserve">edge weight means as a distance; these are documented in</w:t>
-      </w:r>
-      <w:r>
-        <w:t xml:space="preserve"> </w:t>
-      </w:r>
-      <w:r>
-        <w:rPr>
-          <w:rStyle w:val="VerbatimChar"/>
-        </w:rPr>
-        <w:t xml:space="preserve">docs/decisions.md</w:t>
-      </w:r>
-      <w:r>
-        <w:t xml:space="preserve"> </w:t>
-      </w:r>
-      <w:r>
-        <w:t xml:space="preserve">(D1-D6) and summarized</w:t>
-      </w:r>
-      <w:r>
-        <w:t xml:space="preserve"> </w:t>
-      </w:r>
-      <w:r>
-        <w:t xml:space="preserve">here.</w:t>
-      </w:r>
-    </w:p>
-    <w:bookmarkStart w:id="10" w:name="Xde03563cf80caecc49d916aa684dfe68c08826a"/>
-    <w:p>
-      <w:pPr>
-        <w:pStyle w:val="Heading3"/>
       </w:pPr>
       <w:r>
         <w:t xml:space="preserve">2.1 Raw data</w:t>
@@ -736,11 +750,11 @@
         </w:tc>
       </w:tr>
     </w:tbl>
-    <w:bookmarkEnd w:id="10"/>
-    <w:bookmarkStart w:id="11" w:name="Xa4ab56570ed469a44ec47e43e0f5713f4b5687f"/>
-    <w:p>
-      <w:pPr>
-        <w:pStyle w:val="Heading3"/>
+    <w:bookmarkEnd w:id="11"/>
+    <w:bookmarkStart w:id="12" w:name="Xa4ab56570ed469a44ec47e43e0f5713f4b5687f"/>
+    <w:p>
+      <w:pPr>
+        <w:pStyle w:val="Heading2"/>
       </w:pPr>
       <w:r>
         <w:t xml:space="preserve">2.2 From weights to distances</w:t>
@@ -889,11 +903,11 @@
         <w:t xml:space="preserve">lengths after 1 / weight), are listed in Section 9.</w:t>
       </w:r>
     </w:p>
-    <w:bookmarkEnd w:id="11"/>
-    <w:bookmarkStart w:id="12" w:name="X5f2c6fd397215b7a33cfa39f3e7cd14dcfea038"/>
-    <w:p>
-      <w:pPr>
-        <w:pStyle w:val="Heading3"/>
+    <w:bookmarkEnd w:id="12"/>
+    <w:bookmarkStart w:id="13" w:name="X5f2c6fd397215b7a33cfa39f3e7cd14dcfea038"/>
+    <w:p>
+      <w:pPr>
+        <w:pStyle w:val="Heading2"/>
       </w:pPr>
       <w:r>
         <w:t xml:space="preserve">2.3 Networks as used in the benchmark</w:t>
@@ -1594,24 +1608,24 @@
         <w:t xml:space="preserve">.</w:t>
       </w:r>
     </w:p>
-    <w:bookmarkEnd w:id="12"/>
     <w:bookmarkEnd w:id="13"/>
-    <w:bookmarkStart w:id="16" w:name="Xe8ad1569e064c16018380b6c7f5f3f30829a174"/>
+    <w:bookmarkEnd w:id="14"/>
+    <w:bookmarkStart w:id="18" w:name="Xe8ad1569e064c16018380b6c7f5f3f30829a174"/>
+    <w:p>
+      <w:pPr>
+        <w:pStyle w:val="Heading1"/>
+      </w:pPr>
+      <w:r>
+        <w:t xml:space="preserve">3. Implementations and method</w:t>
+      </w:r>
+    </w:p>
+    <w:bookmarkStart w:id="15" w:name="X95c066f7975009f14e9c38ad50cda76f743f653"/>
     <w:p>
       <w:pPr>
         <w:pStyle w:val="Heading2"/>
       </w:pPr>
       <w:r>
-        <w:t xml:space="preserve">3. Implementations and method</w:t>
-      </w:r>
-    </w:p>
-    <w:bookmarkStart w:id="14" w:name="Xcbf15abec3c1a32376ffa4d3b61f1a4cf265455"/>
-    <w:p>
-      <w:pPr>
-        <w:pStyle w:val="Heading3"/>
-      </w:pPr>
-      <w:r>
-        <w:t xml:space="preserve">3.1 Implementations</w:t>
+        <w:t xml:space="preserve">3.0 The two approaches and their complexity</w:t>
       </w:r>
     </w:p>
     <w:tbl>
@@ -1635,6 +1649,238 @@
             <w:pPr>
               <w:pStyle w:val="Compact"/>
             </w:pPr>
+          </w:p>
+        </w:tc>
+        <w:tc>
+          <w:tcPr/>
+          <w:p>
+            <w:pPr>
+              <w:pStyle w:val="Compact"/>
+            </w:pPr>
+            <w:r>
+              <w:t xml:space="preserve">n x Dijkstra</w:t>
+            </w:r>
+          </w:p>
+        </w:tc>
+        <w:tc>
+          <w:tcPr/>
+          <w:p>
+            <w:pPr>
+              <w:pStyle w:val="Compact"/>
+            </w:pPr>
+            <w:r>
+              <w:t xml:space="preserve">Floyd-Warshall</w:t>
+            </w:r>
+          </w:p>
+        </w:tc>
+      </w:tr>
+      <w:tr>
+        <w:tc>
+          <w:tcPr/>
+          <w:p>
+            <w:pPr>
+              <w:pStyle w:val="Compact"/>
+            </w:pPr>
+            <w:r>
+              <w:t xml:space="preserve">Idea</w:t>
+            </w:r>
+          </w:p>
+        </w:tc>
+        <w:tc>
+          <w:tcPr/>
+          <w:p>
+            <w:pPr>
+              <w:pStyle w:val="Compact"/>
+            </w:pPr>
+            <w:r>
+              <w:t xml:space="preserve">single-source shortest paths from each node in turn; settle the closest unsettled node, relax its edges</w:t>
+            </w:r>
+          </w:p>
+        </w:tc>
+        <w:tc>
+          <w:tcPr/>
+          <w:p>
+            <w:pPr>
+              <w:pStyle w:val="Compact"/>
+            </w:pPr>
+            <w:r>
+              <w:t xml:space="preserve">dynamic programming over intermediate nodes: in sweep k, allow node k as a stop for every pair (i, j)</w:t>
+            </w:r>
+          </w:p>
+        </w:tc>
+      </w:tr>
+      <w:tr>
+        <w:tc>
+          <w:tcPr/>
+          <w:p>
+            <w:pPr>
+              <w:pStyle w:val="Compact"/>
+            </w:pPr>
+            <w:r>
+              <w:t xml:space="preserve">Time, binary heap</w:t>
+            </w:r>
+          </w:p>
+        </w:tc>
+        <w:tc>
+          <w:tcPr/>
+          <w:p>
+            <w:pPr>
+              <w:pStyle w:val="Compact"/>
+            </w:pPr>
+            <w:r>
+              <w:t xml:space="preserve">O(n m log n)</w:t>
+            </w:r>
+          </w:p>
+        </w:tc>
+        <w:tc>
+          <w:tcPr/>
+          <w:p>
+            <w:pPr>
+              <w:pStyle w:val="Compact"/>
+            </w:pPr>
+            <w:r>
+              <w:t xml:space="preserve">Theta(n^3), independent of m</w:t>
+            </w:r>
+          </w:p>
+        </w:tc>
+      </w:tr>
+      <w:tr>
+        <w:tc>
+          <w:tcPr/>
+          <w:p>
+            <w:pPr>
+              <w:pStyle w:val="Compact"/>
+            </w:pPr>
+            <w:r>
+              <w:t xml:space="preserve">Time, Fibonacci heap</w:t>
+            </w:r>
+          </w:p>
+        </w:tc>
+        <w:tc>
+          <w:tcPr/>
+          <w:p>
+            <w:pPr>
+              <w:pStyle w:val="Compact"/>
+            </w:pPr>
+            <w:r>
+              <w:t xml:space="preserve">O(n m + n^2 log n)</w:t>
+            </w:r>
+          </w:p>
+        </w:tc>
+        <w:tc>
+          <w:tcPr/>
+          <w:p>
+            <w:pPr>
+              <w:pStyle w:val="Compact"/>
+            </w:pPr>
+            <w:r>
+              <w:t xml:space="preserve">(same)</w:t>
+            </w:r>
+          </w:p>
+        </w:tc>
+      </w:tr>
+      <w:tr>
+        <w:tc>
+          <w:tcPr/>
+          <w:p>
+            <w:pPr>
+              <w:pStyle w:val="Compact"/>
+            </w:pPr>
+            <w:r>
+              <w:t xml:space="preserve">Memory</w:t>
+            </w:r>
+          </w:p>
+        </w:tc>
+        <w:tc>
+          <w:tcPr/>
+          <w:p>
+            <w:pPr>
+              <w:pStyle w:val="Compact"/>
+            </w:pPr>
+            <w:r>
+              <w:t xml:space="preserve">O(n + m) per source, if each row of results is processed and discarded</w:t>
+            </w:r>
+          </w:p>
+        </w:tc>
+        <w:tc>
+          <w:tcPr/>
+          <w:p>
+            <w:pPr>
+              <w:pStyle w:val="Compact"/>
+            </w:pPr>
+            <w:r>
+              <w:t xml:space="preserve">Theta(n^2): the whole distance table at all times</w:t>
+            </w:r>
+          </w:p>
+        </w:tc>
+      </w:tr>
+      <w:tr>
+        <w:tc>
+          <w:tcPr/>
+          <w:p>
+            <w:pPr>
+              <w:pStyle w:val="Compact"/>
+            </w:pPr>
+            <w:r>
+              <w:t xml:space="preserve">Edge weights</w:t>
+            </w:r>
+          </w:p>
+        </w:tc>
+        <w:tc>
+          <w:tcPr/>
+          <w:p>
+            <w:pPr>
+              <w:pStyle w:val="Compact"/>
+            </w:pPr>
+            <w:r>
+              <w:t xml:space="preserve">must be &gt;= 0</w:t>
+            </w:r>
+          </w:p>
+        </w:tc>
+        <w:tc>
+          <w:tcPr/>
+          <w:p>
+            <w:pPr>
+              <w:pStyle w:val="Compact"/>
+            </w:pPr>
+            <w:r>
+              <w:t xml:space="preserve">may be negative; negative cycles detected (negative diagonal)</w:t>
+            </w:r>
+          </w:p>
+        </w:tc>
+      </w:tr>
+    </w:tbl>
+    <w:bookmarkEnd w:id="15"/>
+    <w:bookmarkStart w:id="16" w:name="Xcbf15abec3c1a32376ffa4d3b61f1a4cf265455"/>
+    <w:p>
+      <w:pPr>
+        <w:pStyle w:val="Heading2"/>
+      </w:pPr>
+      <w:r>
+        <w:t xml:space="preserve">3.1 Implementations</w:t>
+      </w:r>
+    </w:p>
+    <w:tbl>
+      <w:tblPr>
+        <w:tblStyle w:val="Table"/>
+        <w:tblW w:type="auto" w:w="0"/>
+        <w:tblLook w:firstRow="1" w:lastRow="0" w:firstColumn="0" w:lastColumn="0" w:noHBand="0" w:noVBand="0" w:val="0020"/>
+      </w:tblPr>
+      <w:tblGrid>
+        <w:gridCol w:w="2640"/>
+        <w:gridCol w:w="2640"/>
+        <w:gridCol w:w="2640"/>
+      </w:tblGrid>
+      <w:tr>
+        <w:trPr>
+          <w:tblHeader w:val="on"/>
+        </w:trPr>
+        <w:tc>
+          <w:tcPr/>
+          <w:p>
+            <w:pPr>
+              <w:pStyle w:val="Compact"/>
+            </w:pPr>
             <w:r>
               <w:t xml:space="preserve">Version</w:t>
             </w:r>
@@ -1961,7 +2207,7 @@
         </w:numPr>
       </w:pPr>
       <w:r>
-        <w:t xml:space="preserve">The pure tier is not purely interpreted: Python's</w:t>
+        <w:t xml:space="preserve">Our pure-Python version is not entirely interpreted: Python's</w:t>
       </w:r>
       <w:r>
         <w:t xml:space="preserve"> </w:t>
@@ -1976,13 +2222,13 @@
         <w:t xml:space="preserve"> </w:t>
       </w:r>
       <w:r>
-        <w:t xml:space="preserve">is written in C, which favors Dijkstra</w:t>
-      </w:r>
-      <w:r>
-        <w:t xml:space="preserve"> </w:t>
-      </w:r>
-      <w:r>
-        <w:t xml:space="preserve">within that tier.</w:t>
+        <w:t xml:space="preserve">is written in C, which</w:t>
+      </w:r>
+      <w:r>
+        <w:t xml:space="preserve"> </w:t>
+      </w:r>
+      <w:r>
+        <w:t xml:space="preserve">favors Dijkstra among the pure-Python measurements.</w:t>
       </w:r>
     </w:p>
     <w:p>
@@ -2052,11 +2298,11 @@
         <w:t xml:space="preserve">n^3).</w:t>
       </w:r>
     </w:p>
-    <w:bookmarkEnd w:id="14"/>
-    <w:bookmarkStart w:id="15" w:name="X0793b4d90d2c4a836c648b571a4ee8a92249ca4"/>
-    <w:p>
-      <w:pPr>
-        <w:pStyle w:val="Heading3"/>
+    <w:bookmarkEnd w:id="16"/>
+    <w:bookmarkStart w:id="17" w:name="X0793b4d90d2c4a836c648b571a4ee8a92249ca4"/>
+    <w:p>
+      <w:pPr>
+        <w:pStyle w:val="Heading2"/>
       </w:pPr>
       <w:r>
         <w:t xml:space="preserve">3.2 Measurement</w:t>
@@ -2267,21 +2513,21 @@
         <w:t xml:space="preserve">Machine: Apple M2, 24 GiB RAM, macOS 26.7.1; Python 3.11.8, numpy 2.4.6, scipy 1.17.1.</w:t>
       </w:r>
     </w:p>
-    <w:bookmarkEnd w:id="15"/>
-    <w:bookmarkEnd w:id="16"/>
-    <w:bookmarkStart w:id="27" w:name="X93718b5a69167cdf47ef63c8161b3c885498559"/>
+    <w:bookmarkEnd w:id="17"/>
+    <w:bookmarkEnd w:id="18"/>
+    <w:bookmarkStart w:id="29" w:name="X93718b5a69167cdf47ef63c8161b3c885498559"/>
+    <w:p>
+      <w:pPr>
+        <w:pStyle w:val="Heading1"/>
+      </w:pPr>
+      <w:r>
+        <w:t xml:space="preserve">4. Results on the five datasets</w:t>
+      </w:r>
+    </w:p>
+    <w:bookmarkStart w:id="22" w:name="X6b83e8af2278b315886124272205095205ff07a"/>
     <w:p>
       <w:pPr>
         <w:pStyle w:val="Heading2"/>
-      </w:pPr>
-      <w:r>
-        <w:t xml:space="preserve">4. Results on the five datasets</w:t>
-      </w:r>
-    </w:p>
-    <w:bookmarkStart w:id="20" w:name="X6b83e8af2278b315886124272205095205ff07a"/>
-    <w:p>
-      <w:pPr>
-        <w:pStyle w:val="Heading3"/>
       </w:pPr>
       <w:r>
         <w:t xml:space="preserve">4.1 Running time</w:t>
@@ -2878,18 +3124,18 @@
           <wp:inline>
             <wp:extent cx="5334000" cy="3259666"/>
             <wp:effectExtent b="0" l="0" r="0" t="0"/>
-            <wp:docPr descr="Time vs network size" title="" id="18" name="Picture"/>
+            <wp:docPr descr="Time vs network size" title="" id="20" name="Picture"/>
             <a:graphic>
               <a:graphicData uri="http://schemas.openxmlformats.org/drawingml/2006/picture">
                 <pic:pic>
                   <pic:nvPicPr>
-                    <pic:cNvPr descr="../results/fig_time_vs_n.png" id="19" name="Picture"/>
+                    <pic:cNvPr descr="../results/fig_time_vs_n.png" id="21" name="Picture"/>
                     <pic:cNvPicPr>
                       <a:picLocks noChangeArrowheads="1" noChangeAspect="1"/>
                     </pic:cNvPicPr>
                   </pic:nvPicPr>
                   <pic:blipFill>
-                    <a:blip r:embed="rId17"/>
+                    <a:blip r:embed="rId19"/>
                     <a:stretch>
                       <a:fillRect/>
                     </a:stretch>
@@ -2921,6 +3167,26 @@
         <w:pStyle w:val="BodyText"/>
       </w:pPr>
       <w:r>
+        <w:t xml:space="preserve">"Infeasible" for numpy FW and pure FW on the two large networks follows from the same memory</w:t>
+      </w:r>
+      <w:r>
+        <w:t xml:space="preserve"> </w:t>
+      </w:r>
+      <w:r>
+        <w:t xml:space="preserve">check as scipy FW (they need 2 and up to 4 times as much memory: 73 GiB and more for Slashdot);</w:t>
+      </w:r>
+      <w:r>
+        <w:t xml:space="preserve"> </w:t>
+      </w:r>
+      <w:r>
+        <w:t xml:space="preserve">they were not submitted to the benchmark runner.</w:t>
+      </w:r>
+    </w:p>
+    <w:p>
+      <w:pPr>
+        <w:pStyle w:val="BodyText"/>
+      </w:pPr>
+      <w:r>
         <w:rPr>
           <w:i/>
           <w:iCs/>
@@ -2942,11 +3208,11 @@
         <w:t xml:space="preserve">Floyd-Warshall. Hollow markers: predicted or estimated, not measured.</w:t>
       </w:r>
     </w:p>
-    <w:bookmarkEnd w:id="20"/>
-    <w:bookmarkStart w:id="24" w:name="X79928f765c017156dfc35a3819611b8c8a9eafb"/>
-    <w:p>
-      <w:pPr>
-        <w:pStyle w:val="Heading3"/>
+    <w:bookmarkEnd w:id="22"/>
+    <w:bookmarkStart w:id="26" w:name="X79928f765c017156dfc35a3819611b8c8a9eafb"/>
+    <w:p>
+      <w:pPr>
+        <w:pStyle w:val="Heading2"/>
       </w:pPr>
       <w:r>
         <w:t xml:space="preserve">4.2 How many times slower Floyd-Warshall is</w:t>
@@ -3161,18 +3427,18 @@
           <wp:inline>
             <wp:extent cx="5334000" cy="3333750"/>
             <wp:effectExtent b="0" l="0" r="0" t="0"/>
-            <wp:docPr descr="Ratio vs network size" title="" id="22" name="Picture"/>
+            <wp:docPr descr="Ratio vs network size" title="" id="24" name="Picture"/>
             <a:graphic>
               <a:graphicData uri="http://schemas.openxmlformats.org/drawingml/2006/picture">
                 <pic:pic>
                   <pic:nvPicPr>
-                    <pic:cNvPr descr="../results/fig_ratio_vs_n.png" id="23" name="Picture"/>
+                    <pic:cNvPr descr="../results/fig_ratio_vs_n.png" id="25" name="Picture"/>
                     <pic:cNvPicPr>
                       <a:picLocks noChangeArrowheads="1" noChangeAspect="1"/>
                     </pic:cNvPicPr>
                   </pic:nvPicPr>
                   <pic:blipFill>
-                    <a:blip r:embed="rId21"/>
+                    <a:blip r:embed="rId23"/>
                     <a:stretch>
                       <a:fillRect/>
                     </a:stretch>
@@ -3225,11 +3491,11 @@
         <w:t xml:space="preserve">theory is shown for reference.</w:t>
       </w:r>
     </w:p>
-    <w:bookmarkEnd w:id="24"/>
-    <w:bookmarkStart w:id="25" w:name="Xca69fe44729c38c7c5fea63a81bd82ab3caa326"/>
-    <w:p>
-      <w:pPr>
-        <w:pStyle w:val="Heading3"/>
+    <w:bookmarkEnd w:id="26"/>
+    <w:bookmarkStart w:id="27" w:name="Xca69fe44729c38c7c5fea63a81bd82ab3caa326"/>
+    <w:p>
+      <w:pPr>
+        <w:pStyle w:val="Heading2"/>
       </w:pPr>
       <w:r>
         <w:t xml:space="preserve">4.3 Correctness</w:t>
@@ -3273,11 +3539,11 @@
         <w:t xml:space="preserve">3.322). All reachable fractions match those computed independently from the network structure.</w:t>
       </w:r>
     </w:p>
-    <w:bookmarkEnd w:id="25"/>
-    <w:bookmarkStart w:id="26" w:name="Xd1cc2eb262fc6c9737260cf824b29d1ccf55435"/>
-    <w:p>
-      <w:pPr>
-        <w:pStyle w:val="Heading3"/>
+    <w:bookmarkEnd w:id="27"/>
+    <w:bookmarkStart w:id="28" w:name="Xd1cc2eb262fc6c9737260cf824b29d1ccf55435"/>
+    <w:p>
+      <w:pPr>
+        <w:pStyle w:val="Heading2"/>
       </w:pPr>
       <w:r>
         <w:t xml:space="preserve">4.4 Memory</w:t>
@@ -3544,12 +3810,12 @@
         <w:t xml:space="preserve">(Table 3).</w:t>
       </w:r>
     </w:p>
-    <w:bookmarkEnd w:id="26"/>
-    <w:bookmarkEnd w:id="27"/>
-    <w:bookmarkStart w:id="28" w:name="Xe55e3ba35be19f0fb162780aa9a332e59f0a045"/>
-    <w:p>
-      <w:pPr>
-        <w:pStyle w:val="Heading2"/>
+    <w:bookmarkEnd w:id="28"/>
+    <w:bookmarkEnd w:id="29"/>
+    <w:bookmarkStart w:id="30" w:name="Xe55e3ba35be19f0fb162780aa9a332e59f0a045"/>
+    <w:p>
+      <w:pPr>
+        <w:pStyle w:val="Heading1"/>
       </w:pPr>
       <w:r>
         <w:t xml:space="preserve">5. Runs that could not complete, explained by complexity</w:t>
@@ -3790,7 +4056,7 @@
         <w:t xml:space="preserve"> </w:t>
       </w:r>
       <w:r>
-        <w:t xml:space="preserve">70,000 full passes, about 2.5 petabytes of disk traffic.</w:t>
+        <w:t xml:space="preserve">70,000 full passes, about 2.7 petabytes of disk traffic.</w:t>
       </w:r>
     </w:p>
     <w:p>
@@ -3871,11 +4137,11 @@
         <w:t xml:space="preserve">n x n table never has to exist. Its time, n x O(m log n), stays small because m is small.</w:t>
       </w:r>
     </w:p>
-    <w:bookmarkEnd w:id="28"/>
-    <w:bookmarkStart w:id="32" w:name="Xc8c310e0ff84947c0a92d904457beb9cfc8df01"/>
-    <w:p>
-      <w:pPr>
-        <w:pStyle w:val="Heading2"/>
+    <w:bookmarkEnd w:id="30"/>
+    <w:bookmarkStart w:id="34" w:name="Xc8c310e0ff84947c0a92d904457beb9cfc8df01"/>
+    <w:p>
+      <w:pPr>
+        <w:pStyle w:val="Heading1"/>
       </w:pPr>
       <w:r>
         <w:t xml:space="preserve">6. Density experiment: where does Floyd-Warshall start to win?</w:t>
@@ -3932,18 +4198,18 @@
           <wp:inline>
             <wp:extent cx="5334000" cy="3259666"/>
             <wp:effectExtent b="0" l="0" r="0" t="0"/>
-            <wp:docPr descr="Density crossover" title="" id="30" name="Picture"/>
+            <wp:docPr descr="Density crossover" title="" id="32" name="Picture"/>
             <a:graphic>
               <a:graphicData uri="http://schemas.openxmlformats.org/drawingml/2006/picture">
                 <pic:pic>
                   <pic:nvPicPr>
-                    <pic:cNvPr descr="../results/fig_density_crossover.png" id="31" name="Picture"/>
+                    <pic:cNvPr descr="../results/fig_density_crossover.png" id="33" name="Picture"/>
                     <pic:cNvPicPr>
                       <a:picLocks noChangeArrowheads="1" noChangeAspect="1"/>
                     </pic:cNvPicPr>
                   </pic:nvPicPr>
                   <pic:blipFill>
-                    <a:blip r:embed="rId29"/>
+                    <a:blip r:embed="rId31"/>
                     <a:stretch>
                       <a:fillRect/>
                     </a:stretch>
@@ -4460,7 +4726,7 @@
         <w:t xml:space="preserve"> </w:t>
       </w:r>
       <w:r>
-        <w:t xml:space="preserve">1% density), FW's time is flat at its n^3 cost, while Dijkstra's keeps growing with m.</w:t>
+        <w:t xml:space="preserve">1-2% density), FW's time is flat at its n^3 cost, while Dijkstra's keeps growing with m.</w:t>
       </w:r>
     </w:p>
     <w:p>
@@ -4578,20 +4844,20 @@
         <w:t xml:space="preserve">.</w:t>
       </w:r>
     </w:p>
-    <w:bookmarkEnd w:id="32"/>
-    <w:bookmarkStart w:id="36" w:name="Xaa41b10cc6ea992ae291d3c205d2ba26cb494fd"/>
+    <w:bookmarkEnd w:id="34"/>
+    <w:bookmarkStart w:id="38" w:name="Xaa41b10cc6ea992ae291d3c205d2ba26cb494fd"/>
+    <w:p>
+      <w:pPr>
+        <w:pStyle w:val="Heading1"/>
+      </w:pPr>
+      <w:r>
+        <w:t xml:space="preserve">7. Discussion</w:t>
+      </w:r>
+    </w:p>
+    <w:bookmarkStart w:id="35" w:name="X43f87316be2c1c871814699ffe7987a01169b86"/>
     <w:p>
       <w:pPr>
         <w:pStyle w:val="Heading2"/>
-      </w:pPr>
-      <w:r>
-        <w:t xml:space="preserve">7. Discussion</w:t>
-      </w:r>
-    </w:p>
-    <w:bookmarkStart w:id="33" w:name="X43f87316be2c1c871814699ffe7987a01169b86"/>
-    <w:p>
-      <w:pPr>
-        <w:pStyle w:val="Heading3"/>
       </w:pPr>
       <w:r>
         <w:t xml:space="preserve">(a) Performance of each algorithm across the five datasets</w:t>
@@ -4714,11 +4980,11 @@
         <w:t xml:space="preserve">the implementation.</w:t>
       </w:r>
     </w:p>
-    <w:bookmarkEnd w:id="33"/>
-    <w:bookmarkStart w:id="34" w:name="X33de842c5c5128ad72f2e16508d11b10547b21b"/>
-    <w:p>
-      <w:pPr>
-        <w:pStyle w:val="Heading3"/>
+    <w:bookmarkEnd w:id="35"/>
+    <w:bookmarkStart w:id="36" w:name="X33de842c5c5128ad72f2e16508d11b10547b21b"/>
+    <w:p>
+      <w:pPr>
+        <w:pStyle w:val="Heading2"/>
       </w:pPr>
       <w:r>
         <w:t xml:space="preserve">(b) How performance changes with network size and density</w:t>
@@ -4828,11 +5094,11 @@
         <w:t xml:space="preserve">Airports) shows the smallest gap.</w:t>
       </w:r>
     </w:p>
-    <w:bookmarkEnd w:id="34"/>
-    <w:bookmarkStart w:id="35" w:name="X2093f61e5e88d917b6a189ffb7cb6dc3330316c"/>
-    <w:p>
-      <w:pPr>
-        <w:pStyle w:val="Heading3"/>
+    <w:bookmarkEnd w:id="36"/>
+    <w:bookmarkStart w:id="37" w:name="X2093f61e5e88d917b6a189ffb7cb6dc3330316c"/>
+    <w:p>
+      <w:pPr>
+        <w:pStyle w:val="Heading2"/>
       </w:pPr>
       <w:r>
         <w:t xml:space="preserve">(c) Which network structures favor which algorithm</w:t>
@@ -5088,12 +5354,12 @@
         <w:t xml:space="preserve">solves them in O(n(n + m)) time without a priority queue.</w:t>
       </w:r>
     </w:p>
-    <w:bookmarkEnd w:id="35"/>
-    <w:bookmarkEnd w:id="36"/>
-    <w:bookmarkStart w:id="37" w:name="X9c770565a839fbcd27d722fed961359d8e72197"/>
-    <w:p>
-      <w:pPr>
-        <w:pStyle w:val="Heading2"/>
+    <w:bookmarkEnd w:id="37"/>
+    <w:bookmarkEnd w:id="38"/>
+    <w:bookmarkStart w:id="39" w:name="X9c770565a839fbcd27d722fed961359d8e72197"/>
+    <w:p>
+      <w:pPr>
+        <w:pStyle w:val="Heading1"/>
       </w:pPr>
       <w:r>
         <w:t xml:space="preserve">8. Reproducing the results</w:t>
@@ -5101,16 +5367,26 @@
     </w:p>
     <w:p>
       <w:pPr>
-        <w:pStyle w:val="FirstParagraph"/>
-      </w:pPr>
-      <w:r>
-        <w:t xml:space="preserve">From the repository root:</w:t>
-      </w:r>
-    </w:p>
-    <w:p>
-      <w:pPr>
         <w:pStyle w:val="SourceCode"/>
       </w:pPr>
+      <w:r>
+        <w:rPr>
+          <w:rStyle w:val="VerbatimChar"/>
+        </w:rPr>
+        <w:t xml:space="preserve">git clone https://github.com/absharotry/mmie.7372.001.NetFlow-DyProg.fall26.git</w:t>
+      </w:r>
+      <w:r>
+        <w:br/>
+      </w:r>
+      <w:r>
+        <w:rPr>
+          <w:rStyle w:val="VerbatimChar"/>
+        </w:rPr>
+        <w:t xml:space="preserve">cd mmie.7372.001.NetFlow-DyProg.fall26</w:t>
+      </w:r>
+      <w:r>
+        <w:br/>
+      </w:r>
       <w:r>
         <w:rPr>
           <w:rStyle w:val="VerbatimChar"/>
@@ -5423,46 +5699,46 @@
         <w:t xml:space="preserve">: correctness tests.</w:t>
       </w:r>
     </w:p>
-    <w:bookmarkEnd w:id="37"/>
-    <w:bookmarkStart w:id="42" w:name="X411092f1d9ae2af905a4220ede8c839e5a19c28"/>
+    <w:bookmarkEnd w:id="39"/>
+    <w:bookmarkStart w:id="44" w:name="X411092f1d9ae2af905a4220ede8c839e5a19c28"/>
+    <w:p>
+      <w:pPr>
+        <w:pStyle w:val="Heading1"/>
+      </w:pPr>
+      <w:r>
+        <w:t xml:space="preserve">9. Assumptions and potential issues</w:t>
+      </w:r>
+    </w:p>
+    <w:p>
+      <w:pPr>
+        <w:pStyle w:val="FirstParagraph"/>
+      </w:pPr>
+      <w:r>
+        <w:t xml:space="preserve">Every modeling and measurement assumption is listed here with what could go wrong and how we checked</w:t>
+      </w:r>
+      <w:r>
+        <w:t xml:space="preserve"> </w:t>
+      </w:r>
+      <w:r>
+        <w:t xml:space="preserve">it. Full reasoning for the data decisions (D1-D6) is in</w:t>
+      </w:r>
+      <w:r>
+        <w:t xml:space="preserve"> </w:t>
+      </w:r>
+      <w:r>
+        <w:rPr>
+          <w:rStyle w:val="VerbatimChar"/>
+        </w:rPr>
+        <w:t xml:space="preserve">docs/decisions.md</w:t>
+      </w:r>
+      <w:r>
+        <w:t xml:space="preserve">.</w:t>
+      </w:r>
+    </w:p>
+    <w:bookmarkStart w:id="40" w:name="X81b7a35303ff1b52bf1581f1c08376172f95005"/>
     <w:p>
       <w:pPr>
         <w:pStyle w:val="Heading2"/>
-      </w:pPr>
-      <w:r>
-        <w:t xml:space="preserve">9. Assumptions and potential issues</w:t>
-      </w:r>
-    </w:p>
-    <w:p>
-      <w:pPr>
-        <w:pStyle w:val="FirstParagraph"/>
-      </w:pPr>
-      <w:r>
-        <w:t xml:space="preserve">Every modeling and measurement assumption is listed here with what could go wrong and how we checked</w:t>
-      </w:r>
-      <w:r>
-        <w:t xml:space="preserve"> </w:t>
-      </w:r>
-      <w:r>
-        <w:t xml:space="preserve">it. Full reasoning for the data decisions (D1-D6) is in</w:t>
-      </w:r>
-      <w:r>
-        <w:t xml:space="preserve"> </w:t>
-      </w:r>
-      <w:r>
-        <w:rPr>
-          <w:rStyle w:val="VerbatimChar"/>
-        </w:rPr>
-        <w:t xml:space="preserve">docs/decisions.md</w:t>
-      </w:r>
-      <w:r>
-        <w:t xml:space="preserve">.</w:t>
-      </w:r>
-    </w:p>
-    <w:bookmarkStart w:id="38" w:name="X81b7a35303ff1b52bf1581f1c08376172f95005"/>
-    <w:p>
-      <w:pPr>
-        <w:pStyle w:val="Heading3"/>
       </w:pPr>
       <w:r>
         <w:t xml:space="preserve">9.1 Turning strength weights into distances (distance = 1 / weight)</w:t>
@@ -5865,11 +6141,11 @@
         </w:tc>
       </w:tr>
     </w:tbl>
-    <w:bookmarkEnd w:id="38"/>
-    <w:bookmarkStart w:id="39" w:name="X0188deefee49dd268dfaf7fa454e764e8064da7"/>
-    <w:p>
-      <w:pPr>
-        <w:pStyle w:val="Heading3"/>
+    <w:bookmarkEnd w:id="40"/>
+    <w:bookmarkStart w:id="41" w:name="X0188deefee49dd268dfaf7fa454e764e8064da7"/>
+    <w:p>
+      <w:pPr>
+        <w:pStyle w:val="Heading2"/>
       </w:pPr>
       <w:r>
         <w:t xml:space="preserve">9.2 Signed networks</w:t>
@@ -6030,11 +6306,11 @@
         </w:tc>
       </w:tr>
     </w:tbl>
-    <w:bookmarkEnd w:id="39"/>
-    <w:bookmarkStart w:id="40" w:name="X63aee14dd9158d851da6ad1378e6d0f232836b1"/>
-    <w:p>
-      <w:pPr>
-        <w:pStyle w:val="Heading3"/>
+    <w:bookmarkEnd w:id="41"/>
+    <w:bookmarkStart w:id="42" w:name="X63aee14dd9158d851da6ad1378e6d0f232836b1"/>
+    <w:p>
+      <w:pPr>
+        <w:pStyle w:val="Heading2"/>
       </w:pPr>
       <w:r>
         <w:t xml:space="preserve">9.3 Cleaning the networks</w:t>
@@ -6271,11 +6547,11 @@
         </w:tc>
       </w:tr>
     </w:tbl>
-    <w:bookmarkEnd w:id="40"/>
-    <w:bookmarkStart w:id="41" w:name="Xa4e3bf44c89c34c744407e922f3c9b44d7f2168"/>
-    <w:p>
-      <w:pPr>
-        <w:pStyle w:val="Heading3"/>
+    <w:bookmarkEnd w:id="42"/>
+    <w:bookmarkStart w:id="43" w:name="Xa4e3bf44c89c34c744407e922f3c9b44d7f2168"/>
+    <w:p>
+      <w:pPr>
+        <w:pStyle w:val="Heading2"/>
       </w:pPr>
       <w:r>
         <w:t xml:space="preserve">9.4 Measurement</w:t>
@@ -6465,23 +6741,7 @@
               <w:pStyle w:val="Compact"/>
             </w:pPr>
             <w:r>
-              <w:t xml:space="preserve">On Advogato, scipy FW's measured memory increase (346 MiB) was about 1.7 times the table size (203 MiB), so the model</w:t>
-            </w:r>
-            <w:r>
-              <w:t xml:space="preserve"> </w:t>
-            </w:r>
-            <w:r>
-              <w:rPr>
-                <w:i/>
-                <w:iCs/>
-              </w:rPr>
-              <w:t xml:space="preserve">underestimates</w:t>
-            </w:r>
-            <w:r>
-              <w:t xml:space="preserve"> </w:t>
-            </w:r>
-            <w:r>
-              <w:t xml:space="preserve">memory: the real requirement for the large networks is even higher than stated.</w:t>
+              <w:t xml:space="preserve">On Advogato, scipy FW's measured memory increase (346 MiB) was 1.7 times the table (203 MiB), but most of the excess comes from our own summary step, which copies the reachable distances (Section 4.4), not from the algorithm. Either way the large networks exceed the budget by far more than any model error: 2.5 times (Slashdot) and 7 times (Wiki Conflict).</w:t>
             </w:r>
           </w:p>
         </w:tc>
@@ -6557,12 +6817,12 @@
         </w:tc>
       </w:tr>
     </w:tbl>
-    <w:bookmarkEnd w:id="41"/>
-    <w:bookmarkEnd w:id="42"/>
-    <w:bookmarkStart w:id="43" w:name="X57d56956c0b631bb6a0ea7bd9242c6129e94934"/>
-    <w:p>
-      <w:pPr>
-        <w:pStyle w:val="Heading2"/>
+    <w:bookmarkEnd w:id="43"/>
+    <w:bookmarkEnd w:id="44"/>
+    <w:bookmarkStart w:id="45" w:name="X57d56956c0b631bb6a0ea7bd9242c6129e94934"/>
+    <w:p>
+      <w:pPr>
+        <w:pStyle w:val="Heading1"/>
       </w:pPr>
       <w:r>
         <w:t xml:space="preserve">10. Limitations</w:t>
@@ -6644,8 +6904,368 @@
         <w:t xml:space="preserve">the ratios and the complexity arguments do not depend on the machine.</w:t>
       </w:r>
     </w:p>
-    <w:bookmarkEnd w:id="43"/>
-    <w:bookmarkEnd w:id="44"/>
+    <w:bookmarkEnd w:id="45"/>
+    <w:bookmarkStart w:id="48" w:name="X726793783ba4ae7f9802481ba226d33bdbc715c"/>
+    <w:p>
+      <w:pPr>
+        <w:pStyle w:val="Heading1"/>
+      </w:pPr>
+      <w:r>
+        <w:t xml:space="preserve">11. References</w:t>
+      </w:r>
+    </w:p>
+    <w:p>
+      <w:pPr>
+        <w:pStyle w:val="Compact"/>
+        <w:numPr>
+          <w:ilvl w:val="0"/>
+          <w:numId w:val="1011"/>
+        </w:numPr>
+      </w:pPr>
+      <w:r>
+        <w:t xml:space="preserve">E. W. Dijkstra (1959). A note on two problems in connexion with graphs.</w:t>
+      </w:r>
+      <w:r>
+        <w:t xml:space="preserve"> </w:t>
+      </w:r>
+      <w:r>
+        <w:rPr>
+          <w:i/>
+          <w:iCs/>
+        </w:rPr>
+        <w:t xml:space="preserve">Numerische Mathematik</w:t>
+      </w:r>
+      <w:r>
+        <w:t xml:space="preserve"> </w:t>
+      </w:r>
+      <w:r>
+        <w:t xml:space="preserve">1, 269-271.</w:t>
+      </w:r>
+    </w:p>
+    <w:p>
+      <w:pPr>
+        <w:pStyle w:val="Compact"/>
+        <w:numPr>
+          <w:ilvl w:val="0"/>
+          <w:numId w:val="1011"/>
+        </w:numPr>
+      </w:pPr>
+      <w:r>
+        <w:t xml:space="preserve">R. W. Floyd (1962). Algorithm 97: Shortest path.</w:t>
+      </w:r>
+      <w:r>
+        <w:t xml:space="preserve"> </w:t>
+      </w:r>
+      <w:r>
+        <w:rPr>
+          <w:i/>
+          <w:iCs/>
+        </w:rPr>
+        <w:t xml:space="preserve">Communications of the ACM</w:t>
+      </w:r>
+      <w:r>
+        <w:t xml:space="preserve"> </w:t>
+      </w:r>
+      <w:r>
+        <w:t xml:space="preserve">5(6), 345.</w:t>
+      </w:r>
+    </w:p>
+    <w:p>
+      <w:pPr>
+        <w:pStyle w:val="Compact"/>
+        <w:numPr>
+          <w:ilvl w:val="0"/>
+          <w:numId w:val="1011"/>
+        </w:numPr>
+      </w:pPr>
+      <w:r>
+        <w:t xml:space="preserve">S. Warshall (1962). A theorem on Boolean matrices.</w:t>
+      </w:r>
+      <w:r>
+        <w:t xml:space="preserve"> </w:t>
+      </w:r>
+      <w:r>
+        <w:rPr>
+          <w:i/>
+          <w:iCs/>
+        </w:rPr>
+        <w:t xml:space="preserve">Journal of the ACM</w:t>
+      </w:r>
+      <w:r>
+        <w:t xml:space="preserve"> </w:t>
+      </w:r>
+      <w:r>
+        <w:t xml:space="preserve">9(1), 11-12.</w:t>
+      </w:r>
+    </w:p>
+    <w:p>
+      <w:pPr>
+        <w:pStyle w:val="Compact"/>
+        <w:numPr>
+          <w:ilvl w:val="0"/>
+          <w:numId w:val="1011"/>
+        </w:numPr>
+      </w:pPr>
+      <w:r>
+        <w:t xml:space="preserve">M. L. Fredman, R. E. Tarjan (1987). Fibonacci heaps and their uses in improved network optimization algorithms.</w:t>
+      </w:r>
+      <w:r>
+        <w:t xml:space="preserve"> </w:t>
+      </w:r>
+      <w:r>
+        <w:rPr>
+          <w:i/>
+          <w:iCs/>
+        </w:rPr>
+        <w:t xml:space="preserve">Journal of the ACM</w:t>
+      </w:r>
+      <w:r>
+        <w:t xml:space="preserve"> </w:t>
+      </w:r>
+      <w:r>
+        <w:t xml:space="preserve">34(3), 596-615.</w:t>
+      </w:r>
+    </w:p>
+    <w:p>
+      <w:pPr>
+        <w:pStyle w:val="Compact"/>
+        <w:numPr>
+          <w:ilvl w:val="0"/>
+          <w:numId w:val="1011"/>
+        </w:numPr>
+      </w:pPr>
+      <w:r>
+        <w:t xml:space="preserve">T. Opsahl, F. Agneessens, J. Skvoretz (2010). Node centrality in weighted networks: Generalizing degree and shortest paths.</w:t>
+      </w:r>
+      <w:r>
+        <w:t xml:space="preserve"> </w:t>
+      </w:r>
+      <w:r>
+        <w:rPr>
+          <w:i/>
+          <w:iCs/>
+        </w:rPr>
+        <w:t xml:space="preserve">Social Networks</w:t>
+      </w:r>
+      <w:r>
+        <w:t xml:space="preserve"> </w:t>
+      </w:r>
+      <w:r>
+        <w:t xml:space="preserve">32(3), 245-251.</w:t>
+      </w:r>
+    </w:p>
+    <w:p>
+      <w:pPr>
+        <w:pStyle w:val="Compact"/>
+        <w:numPr>
+          <w:ilvl w:val="0"/>
+          <w:numId w:val="1011"/>
+        </w:numPr>
+      </w:pPr>
+      <w:r>
+        <w:t xml:space="preserve">J. Kunegis (2013). KONECT: The Koblenz Network Collection.</w:t>
+      </w:r>
+      <w:r>
+        <w:t xml:space="preserve"> </w:t>
+      </w:r>
+      <w:r>
+        <w:rPr>
+          <w:i/>
+          <w:iCs/>
+        </w:rPr>
+        <w:t xml:space="preserve">Proc. WWW 2013 Companion</w:t>
+      </w:r>
+      <w:r>
+        <w:t xml:space="preserve">, 1343-1350.</w:t>
+      </w:r>
+    </w:p>
+    <w:p>
+      <w:pPr>
+        <w:pStyle w:val="Compact"/>
+        <w:numPr>
+          <w:ilvl w:val="0"/>
+          <w:numId w:val="1011"/>
+        </w:numPr>
+      </w:pPr>
+      <w:r>
+        <w:t xml:space="preserve">T. P. Peixoto. The Netzschleuder network catalogue and repository.</w:t>
+      </w:r>
+      <w:r>
+        <w:t xml:space="preserve"> </w:t>
+      </w:r>
+      <w:hyperlink r:id="rId46">
+        <w:r>
+          <w:rPr>
+            <w:rStyle w:val="Hyperlink"/>
+          </w:rPr>
+          <w:t xml:space="preserve">https://networks.skewed.de</w:t>
+        </w:r>
+      </w:hyperlink>
+    </w:p>
+    <w:p>
+      <w:pPr>
+        <w:pStyle w:val="Compact"/>
+        <w:numPr>
+          <w:ilvl w:val="0"/>
+          <w:numId w:val="1011"/>
+        </w:numPr>
+      </w:pPr>
+      <w:r>
+        <w:t xml:space="preserve">T. Opsahl (2011). Why Anchorage is not (that) important: Binary ties and sample selection. Blog post,</w:t>
+      </w:r>
+      <w:r>
+        <w:t xml:space="preserve"> </w:t>
+      </w:r>
+      <w:hyperlink r:id="rId47">
+        <w:r>
+          <w:rPr>
+            <w:rStyle w:val="Hyperlink"/>
+          </w:rPr>
+          <w:t xml:space="preserve">http://wp.me/poFcY-Vw</w:t>
+        </w:r>
+      </w:hyperlink>
+      <w:r>
+        <w:t xml:space="preserve"> </w:t>
+      </w:r>
+      <w:r>
+        <w:t xml:space="preserve">(US Airports data).</w:t>
+      </w:r>
+    </w:p>
+    <w:p>
+      <w:pPr>
+        <w:pStyle w:val="Compact"/>
+        <w:numPr>
+          <w:ilvl w:val="0"/>
+          <w:numId w:val="1011"/>
+        </w:numPr>
+      </w:pPr>
+      <w:r>
+        <w:t xml:space="preserve">J. Moody (2001). Peer influence groups: identifying dense clusters in large networks.</w:t>
+      </w:r>
+      <w:r>
+        <w:t xml:space="preserve"> </w:t>
+      </w:r>
+      <w:r>
+        <w:rPr>
+          <w:i/>
+          <w:iCs/>
+        </w:rPr>
+        <w:t xml:space="preserve">Social Networks</w:t>
+      </w:r>
+      <w:r>
+        <w:t xml:space="preserve"> </w:t>
+      </w:r>
+      <w:r>
+        <w:t xml:space="preserve">23(4), 261-283 (Adolescent Health data).</w:t>
+      </w:r>
+    </w:p>
+    <w:p>
+      <w:pPr>
+        <w:pStyle w:val="Compact"/>
+        <w:numPr>
+          <w:ilvl w:val="0"/>
+          <w:numId w:val="1011"/>
+        </w:numPr>
+      </w:pPr>
+      <w:r>
+        <w:t xml:space="preserve">P. Massa, M. Salvetti, D. Tomasoni (2009). Bowling alone and trust decline in social network sites.</w:t>
+      </w:r>
+      <w:r>
+        <w:t xml:space="preserve"> </w:t>
+      </w:r>
+      <w:r>
+        <w:rPr>
+          <w:i/>
+          <w:iCs/>
+        </w:rPr>
+        <w:t xml:space="preserve">Proc. IEEE DASC 2009</w:t>
+      </w:r>
+      <w:r>
+        <w:t xml:space="preserve"> </w:t>
+      </w:r>
+      <w:r>
+        <w:t xml:space="preserve">(Advogato data).</w:t>
+      </w:r>
+    </w:p>
+    <w:p>
+      <w:pPr>
+        <w:pStyle w:val="Compact"/>
+        <w:numPr>
+          <w:ilvl w:val="0"/>
+          <w:numId w:val="1011"/>
+        </w:numPr>
+      </w:pPr>
+      <w:r>
+        <w:t xml:space="preserve">J. Kunegis, A. Lommatzsch, C. Bauckhage (2009). The Slashdot Zoo: Mining a social network with negative edges.</w:t>
+      </w:r>
+      <w:r>
+        <w:t xml:space="preserve"> </w:t>
+      </w:r>
+      <w:r>
+        <w:rPr>
+          <w:i/>
+          <w:iCs/>
+        </w:rPr>
+        <w:t xml:space="preserve">Proc. WWW 2009</w:t>
+      </w:r>
+      <w:r>
+        <w:t xml:space="preserve">, 741-750.</w:t>
+      </w:r>
+    </w:p>
+    <w:p>
+      <w:pPr>
+        <w:pStyle w:val="Compact"/>
+        <w:numPr>
+          <w:ilvl w:val="0"/>
+          <w:numId w:val="1011"/>
+        </w:numPr>
+      </w:pPr>
+      <w:r>
+        <w:t xml:space="preserve">U. Brandes, P. Kenis, J. Lerner, D. van Raaij (2009). Network analysis of collaboration structure in Wikipedia.</w:t>
+      </w:r>
+      <w:r>
+        <w:t xml:space="preserve"> </w:t>
+      </w:r>
+      <w:r>
+        <w:rPr>
+          <w:i/>
+          <w:iCs/>
+        </w:rPr>
+        <w:t xml:space="preserve">Proc. WWW 2009</w:t>
+      </w:r>
+      <w:r>
+        <w:t xml:space="preserve">, 731-740 (Wiki Conflict data).</w:t>
+      </w:r>
+    </w:p>
+    <w:p>
+      <w:pPr>
+        <w:pStyle w:val="Compact"/>
+        <w:numPr>
+          <w:ilvl w:val="0"/>
+          <w:numId w:val="1011"/>
+        </w:numPr>
+      </w:pPr>
+      <w:r>
+        <w:t xml:space="preserve">P. Virtanen et al. (2020). SciPy 1.0: Fundamental algorithms for scientific computing in Python.</w:t>
+      </w:r>
+      <w:r>
+        <w:t xml:space="preserve"> </w:t>
+      </w:r>
+      <w:r>
+        <w:rPr>
+          <w:i/>
+          <w:iCs/>
+        </w:rPr>
+        <w:t xml:space="preserve">Nature Methods</w:t>
+      </w:r>
+      <w:r>
+        <w:t xml:space="preserve"> </w:t>
+      </w:r>
+      <w:r>
+        <w:t xml:space="preserve">17, 261-272.</w:t>
+      </w:r>
+    </w:p>
+    <w:bookmarkEnd w:id="48"/>
     <w:sectPr>
       <w:footnotePr>
         <w:numRestart w:val="eachSect"/>
@@ -6890,6 +7510,9 @@
     <w:abstractNumId w:val="991"/>
   </w:num>
   <w:num w:numId="1010">
+    <w:abstractNumId w:val="991"/>
+  </w:num>
+  <w:num w:numId="1011">
     <w:abstractNumId w:val="991"/>
   </w:num>
 </w:numbering>

</xml_diff>

<commit_message>
Wiki Conflict: full run of our pure-Python Dijkstra (8.00 h) replaces the estimate
Full run matches scipy exactly (12,796,704,262 reachable pairs, mean 3.3224).
The 1,000-source sample had predicted 7.65 h (4.5% low), now reported as a
check of the sampling method. Report, tables, figure (measured point instead
of estimate), Word file, run instructions and CLAUDE.md status updated.

Co-Authored-By: Claude Opus 5.5 <noreply@anthropic.com>
</commit_message>
<xml_diff>
--- a/computational-study-1-apsp/docs/comparison_report.docx
+++ b/computational-study-1-apsp/docs/comparison_report.docx
@@ -194,13 +194,7 @@
         <w:t xml:space="preserve"> </w:t>
       </w:r>
       <w:r>
-        <w:t xml:space="preserve">own pure-Python Dijkstra finished Slashdot in 24.8 minutes and is estimated at 7.7 hours for Wiki</w:t>
-      </w:r>
-      <w:r>
-        <w:t xml:space="preserve"> </w:t>
-      </w:r>
-      <w:r>
-        <w:t xml:space="preserve">Conflict.</w:t>
+        <w:t xml:space="preserve">own pure-Python Dijkstra finished Slashdot in 24.8 minutes and Wiki Conflict in 8.0 hours.</w:t>
       </w:r>
     </w:p>
     <w:p>
@@ -2452,19 +2446,25 @@
           <w:b/>
           <w:bCs/>
         </w:rPr>
-        <w:t xml:space="preserve">Sampling (one case):</w:t>
-      </w:r>
-      <w:r>
-        <w:t xml:space="preserve"> </w:t>
-      </w:r>
-      <w:r>
-        <w:t xml:space="preserve">our pure Dijkstra on Wiki Conflict was timed on 1,000 randomly chosen</w:t>
-      </w:r>
-      <w:r>
-        <w:t xml:space="preserve"> </w:t>
-      </w:r>
-      <w:r>
-        <w:t xml:space="preserve">sources (fixed seed) and scaled by n / 1,000. This is an estimate and is labelled as such.</w:t>
+        <w:t xml:space="preserve">Sampling as a check:</w:t>
+      </w:r>
+      <w:r>
+        <w:t xml:space="preserve"> </w:t>
+      </w:r>
+      <w:r>
+        <w:t xml:space="preserve">before the 8-hour full run of our pure Dijkstra on Wiki Conflict, we</w:t>
+      </w:r>
+      <w:r>
+        <w:t xml:space="preserve"> </w:t>
+      </w:r>
+      <w:r>
+        <w:t xml:space="preserve">timed 1,000 randomly chosen sources (fixed seed) and scaled by n / 1,000: 7.65 h predicted. The</w:t>
+      </w:r>
+      <w:r>
+        <w:t xml:space="preserve"> </w:t>
+      </w:r>
+      <w:r>
+        <w:t xml:space="preserve">full run took 8.00 h, 4.5% more, so sampling is a reliable way to estimate such runs.</w:t>
       </w:r>
     </w:p>
     <w:p>
@@ -3092,13 +3092,7 @@
                 <w:b/>
                 <w:bCs/>
               </w:rPr>
-              <w:t xml:space="preserve">~7.7 h</w:t>
-            </w:r>
-            <w:r>
-              <w:t xml:space="preserve"> </w:t>
-            </w:r>
-            <w:r>
-              <w:t xml:space="preserve">(estimated from 1,000 sources)</w:t>
+              <w:t xml:space="preserve">8.0 h</w:t>
             </w:r>
           </w:p>
         </w:tc>
@@ -3205,7 +3199,7 @@
           <w:i/>
           <w:iCs/>
         </w:rPr>
-        <w:t xml:space="preserve">Floyd-Warshall. Hollow markers: predicted or estimated, not measured.</w:t>
+        <w:t xml:space="preserve">Floyd-Warshall. Hollow markers: predicted, not measured.</w:t>
       </w:r>
     </w:p>
     <w:bookmarkEnd w:id="22"/>
@@ -3524,19 +3518,13 @@
         <w:t xml:space="preserve"> </w:t>
       </w:r>
       <w:r>
-        <w:t xml:space="preserve">reachable pairs with the same mean distance (4.8811). On Wiki Conflict, scipy found 12,796,704,262</w:t>
-      </w:r>
-      <w:r>
-        <w:t xml:space="preserve"> </w:t>
-      </w:r>
-      <w:r>
-        <w:t xml:space="preserve">reachable pairs (93.8%); our 1,000-source sample gives 93.1% and a mean distance of 3.330 (full run:</w:t>
-      </w:r>
-      <w:r>
-        <w:t xml:space="preserve"> </w:t>
-      </w:r>
-      <w:r>
-        <w:t xml:space="preserve">3.322). All reachable fractions match those computed independently from the network structure.</w:t>
+        <w:t xml:space="preserve">reachable pairs with the same mean distance (4.8811). On Wiki Conflict, our pure Dijkstra and scipy's both found</w:t>
+      </w:r>
+      <w:r>
+        <w:t xml:space="preserve"> </w:t>
+      </w:r>
+      <w:r>
+        <w:t xml:space="preserve">exactly 12,796,704,262 reachable pairs (93.8%) with the same mean distance (3.3224). All reachable fractions match those computed independently from the network structure.</w:t>
       </w:r>
     </w:p>
     <w:bookmarkEnd w:id="27"/>
@@ -3763,7 +3751,7 @@
               <w:pStyle w:val="Compact"/>
             </w:pPr>
             <w:r>
-              <w:t xml:space="preserve">1,183 MiB (sampled run)</w:t>
+              <w:t xml:space="preserve">1,173 MiB</w:t>
             </w:r>
           </w:p>
         </w:tc>
@@ -4892,7 +4880,7 @@
         <w:t xml:space="preserve"> </w:t>
       </w:r>
       <w:r>
-        <w:t xml:space="preserve">an estimated 7.7 hours (Wiki Conflict) with our own pure-Python code.</w:t>
+        <w:t xml:space="preserve">8.0 hours (Wiki Conflict) with our own pure-Python code.</w:t>
       </w:r>
     </w:p>
     <w:p>
@@ -5454,7 +5442,7 @@
         <w:rPr>
           <w:rStyle w:val="VerbatimChar"/>
         </w:rPr>
-        <w:t xml:space="preserve">python scripts/run_pure_large.py --stages slashdot,sample   # our Dijkstra on the two large networks</w:t>
+        <w:t xml:space="preserve">python scripts/run_pure_large.py --stages slashdot,sample,full --deadline 23:59   # our Dijkstra on the two large networks (~8.5 h)</w:t>
       </w:r>
       <w:r>
         <w:br/>
@@ -6649,7 +6637,7 @@
               <w:pStyle w:val="Compact"/>
             </w:pPr>
             <w:r>
-              <w:t xml:space="preserve">Our pure Dijkstra on Wiki Conflict is estimated from 1,000 random sources (time x n / 1,000).</w:t>
+              <w:t xml:space="preserve">(Resolved.) Our pure Dijkstra on Wiki Conflict was first estimated from 1,000 random sources.</w:t>
             </w:r>
           </w:p>
         </w:tc>
@@ -6671,7 +6659,7 @@
               <w:pStyle w:val="Compact"/>
             </w:pPr>
             <w:r>
-              <w:t xml:space="preserve">The sample's reachable share (93.1%) and mean distance (3.330) are close to the full scipy run's (93.8%, 3.322), so the sample is representative to within a few percent.</w:t>
+              <w:t xml:space="preserve">The full run was completed (8.00 h); the sample had predicted 7.65 h, 4.5% low. The reported time is the measured one.</w:t>
             </w:r>
           </w:p>
         </w:tc>
@@ -6826,40 +6814,6 @@
       </w:pPr>
       <w:r>
         <w:t xml:space="preserve">10. Limitations</w:t>
-      </w:r>
-    </w:p>
-    <w:p>
-      <w:pPr>
-        <w:pStyle w:val="Compact"/>
-        <w:numPr>
-          <w:ilvl w:val="0"/>
-          <w:numId w:val="1010"/>
-        </w:numPr>
-      </w:pPr>
-      <w:r>
-        <w:t xml:space="preserve">Our pure-Python Dijkstra on Wiki Conflict is an</w:t>
-      </w:r>
-      <w:r>
-        <w:t xml:space="preserve"> </w:t>
-      </w:r>
-      <w:r>
-        <w:rPr>
-          <w:b/>
-          <w:bCs/>
-        </w:rPr>
-        <w:t xml:space="preserve">estimate</w:t>
-      </w:r>
-      <w:r>
-        <w:t xml:space="preserve"> </w:t>
-      </w:r>
-      <w:r>
-        <w:t xml:space="preserve">from 1,000 random sources, scaled to</w:t>
-      </w:r>
-      <w:r>
-        <w:t xml:space="preserve"> </w:t>
-      </w:r>
-      <w:r>
-        <w:t xml:space="preserve">all 116,836. A full run takes about 7.7 hours.</w:t>
       </w:r>
     </w:p>
     <w:p>

</xml_diff>

<commit_message>
Add author name and date to the report and project README
Co-Authored-By: Claude Opus 5.5 <noreply@anthropic.com>
</commit_message>
<xml_diff>
--- a/computational-study-1-apsp/docs/comparison_report.docx
+++ b/computational-study-1-apsp/docs/comparison_report.docx
@@ -41,7 +41,23 @@
         <w:pStyle w:val="FirstParagraph"/>
       </w:pPr>
       <w:r>
-        <w:t xml:space="preserve">MMIE 7372, Network Flows: Computational Study 1.</w:t>
+        <w:rPr>
+          <w:b/>
+          <w:bCs/>
+        </w:rPr>
+        <w:t xml:space="preserve">Abhimanyu Sharotry</w:t>
+      </w:r>
+      <w:r>
+        <w:br/>
+      </w:r>
+      <w:r>
+        <w:t xml:space="preserve">MMIE 7372 Network Flows and Dynamic Programming, Fall 2026: Computational Study 1</w:t>
+      </w:r>
+      <w:r>
+        <w:br/>
+      </w:r>
+      <w:r>
+        <w:t xml:space="preserve">October 13, 2026</w:t>
       </w:r>
     </w:p>
     <w:p>

</xml_diff>

<commit_message>
Word report: author, subtitle and date on the first page, above the contents
build_word_report.py reads the report's title block and passes it to pandoc as
document metadata, so it renders under the title before the table of contents.

Co-Authored-By: Claude Opus 5.5 <noreply@anthropic.com>
</commit_message>
<xml_diff>
--- a/computational-study-1-apsp/docs/comparison_report.docx
+++ b/computational-study-1-apsp/docs/comparison_report.docx
@@ -8,6 +8,30 @@
       </w:pPr>
       <w:r>
         <w:t xml:space="preserve">All-pairs shortest paths: n x Dijkstra vs Floyd-Warshall on five real networks</w:t>
+      </w:r>
+    </w:p>
+    <w:p>
+      <w:pPr>
+        <w:pStyle w:val="Subtitle"/>
+      </w:pPr>
+      <w:r>
+        <w:t xml:space="preserve">MMIE 7372 Network Flows and Dynamic Programming, Fall 2026: Computational Study 1</w:t>
+      </w:r>
+    </w:p>
+    <w:p>
+      <w:pPr>
+        <w:pStyle w:val="Author"/>
+      </w:pPr>
+      <w:r>
+        <w:t xml:space="preserve">Abhimanyu Sharotry</w:t>
+      </w:r>
+    </w:p>
+    <w:p>
+      <w:pPr>
+        <w:pStyle w:val="Date"/>
+      </w:pPr>
+      <w:r>
+        <w:t xml:space="preserve">October 13, 2026</w:t>
       </w:r>
     </w:p>
     <w:sdt>
@@ -39,30 +63,6 @@
     <w:p>
       <w:pPr>
         <w:pStyle w:val="FirstParagraph"/>
-      </w:pPr>
-      <w:r>
-        <w:rPr>
-          <w:b/>
-          <w:bCs/>
-        </w:rPr>
-        <w:t xml:space="preserve">Abhimanyu Sharotry</w:t>
-      </w:r>
-      <w:r>
-        <w:br/>
-      </w:r>
-      <w:r>
-        <w:t xml:space="preserve">MMIE 7372 Network Flows and Dynamic Programming, Fall 2026: Computational Study 1</w:t>
-      </w:r>
-      <w:r>
-        <w:br/>
-      </w:r>
-      <w:r>
-        <w:t xml:space="preserve">October 13, 2026</w:t>
-      </w:r>
-    </w:p>
-    <w:p>
-      <w:pPr>
-        <w:pStyle w:val="BodyText"/>
       </w:pPr>
       <w:r>
         <w:rPr>

</xml_diff>

<commit_message>
Disclose AI assistance in the report (Section 12) and README
Who did what (author vs Claude Opus 5.5 via Claude Code), how AI output was
checked, and how to trace AI-made commits (Co-Authored-By trailer; the one
exception, merge commit c8140d6, is named). Word file rebuilt.

Co-Authored-By: Claude Opus 5.5 <noreply@anthropic.com>
</commit_message>
<xml_diff>
--- a/computational-study-1-apsp/docs/comparison_report.docx
+++ b/computational-study-1-apsp/docs/comparison_report.docx
@@ -63,6 +63,24 @@
     <w:p>
       <w:pPr>
         <w:pStyle w:val="FirstParagraph"/>
+      </w:pPr>
+      <w:r>
+        <w:rPr>
+          <w:b/>
+          <w:bCs/>
+        </w:rPr>
+        <w:t xml:space="preserve">AI assistance:</w:t>
+      </w:r>
+      <w:r>
+        <w:t xml:space="preserve"> </w:t>
+      </w:r>
+      <w:r>
+        <w:t xml:space="preserve">this study was carried out with substantial help from an AI coding assistant (Claude Opus 5.5 by Anthropic, used through Claude Code). The assistant wrote the code, ran the experiments and drafted this report under the author's direction; the author made the modeling and study-design decisions. Details in Section 12.</w:t>
+      </w:r>
+    </w:p>
+    <w:p>
+      <w:pPr>
+        <w:pStyle w:val="BodyText"/>
       </w:pPr>
       <w:r>
         <w:rPr>
@@ -7236,6 +7254,549 @@
       </w:r>
     </w:p>
     <w:bookmarkEnd w:id="48"/>
+    <w:bookmarkStart w:id="51" w:name="X31c0c3c89954e4a8a93d1d2e94aae256af75ef1"/>
+    <w:p>
+      <w:pPr>
+        <w:pStyle w:val="Heading1"/>
+      </w:pPr>
+      <w:r>
+        <w:t xml:space="preserve">12. Use of AI assistance</w:t>
+      </w:r>
+    </w:p>
+    <w:p>
+      <w:pPr>
+        <w:pStyle w:val="FirstParagraph"/>
+      </w:pPr>
+      <w:r>
+        <w:t xml:space="preserve">This study was carried out with an AI coding assistant:</w:t>
+      </w:r>
+      <w:r>
+        <w:t xml:space="preserve"> </w:t>
+      </w:r>
+      <w:r>
+        <w:rPr>
+          <w:b/>
+          <w:bCs/>
+        </w:rPr>
+        <w:t xml:space="preserve">Claude Opus 5.5 (Anthropic), used through</w:t>
+      </w:r>
+      <w:r>
+        <w:rPr>
+          <w:b/>
+          <w:bCs/>
+        </w:rPr>
+        <w:t xml:space="preserve"> </w:t>
+      </w:r>
+      <w:r>
+        <w:rPr>
+          <w:b/>
+          <w:bCs/>
+        </w:rPr>
+        <w:t xml:space="preserve">Claude Code</w:t>
+      </w:r>
+      <w:r>
+        <w:t xml:space="preserve"> </w:t>
+      </w:r>
+      <w:r>
+        <w:t xml:space="preserve">in the VS Code editor, on October 12-13, 2026. The assistant worked in the project</w:t>
+      </w:r>
+      <w:r>
+        <w:t xml:space="preserve"> </w:t>
+      </w:r>
+      <w:r>
+        <w:t xml:space="preserve">folder, wrote and ran code, and committed to the Git repository using the author's Git settings, so</w:t>
+      </w:r>
+      <w:r>
+        <w:t xml:space="preserve"> </w:t>
+      </w:r>
+      <w:r>
+        <w:t xml:space="preserve">every commit lists the author's name as Git author. The commits the assistant made are marked by a</w:t>
+      </w:r>
+      <w:r>
+        <w:t xml:space="preserve"> </w:t>
+      </w:r>
+      <w:r>
+        <w:rPr>
+          <w:rStyle w:val="VerbatimChar"/>
+        </w:rPr>
+        <w:t xml:space="preserve">Co-Authored-By: Claude</w:t>
+      </w:r>
+      <w:r>
+        <w:t xml:space="preserve"> </w:t>
+      </w:r>
+      <w:r>
+        <w:t xml:space="preserve">line, with one exception: merge commit</w:t>
+      </w:r>
+      <w:r>
+        <w:t xml:space="preserve"> </w:t>
+      </w:r>
+      <w:r>
+        <w:rPr>
+          <w:rStyle w:val="VerbatimChar"/>
+        </w:rPr>
+        <w:t xml:space="preserve">c8140d6</w:t>
+      </w:r>
+      <w:r>
+        <w:t xml:space="preserve">, which joined this project</w:t>
+      </w:r>
+      <w:r>
+        <w:t xml:space="preserve"> </w:t>
+      </w:r>
+      <w:r>
+        <w:t xml:space="preserve">with the course repository's initial commit. The only commit not made by the assistant is that</w:t>
+      </w:r>
+      <w:r>
+        <w:t xml:space="preserve"> </w:t>
+      </w:r>
+      <w:r>
+        <w:t xml:space="preserve">initial commit (</w:t>
+      </w:r>
+      <w:r>
+        <w:rPr>
+          <w:rStyle w:val="VerbatimChar"/>
+        </w:rPr>
+        <w:t xml:space="preserve">9d2fb91</w:t>
+      </w:r>
+      <w:r>
+        <w:t xml:space="preserve">, created on GitHub by the author). The project's</w:t>
+      </w:r>
+      <w:r>
+        <w:t xml:space="preserve"> </w:t>
+      </w:r>
+      <w:r>
+        <w:rPr>
+          <w:rStyle w:val="VerbatimChar"/>
+        </w:rPr>
+        <w:t xml:space="preserve">CLAUDE.md</w:t>
+      </w:r>
+      <w:r>
+        <w:t xml:space="preserve"> </w:t>
+      </w:r>
+      <w:r>
+        <w:t xml:space="preserve">file contains the working instructions the author gave the assistant.</w:t>
+      </w:r>
+    </w:p>
+    <w:bookmarkStart w:id="49" w:name="who-did-what"/>
+    <w:p>
+      <w:pPr>
+        <w:pStyle w:val="Heading2"/>
+      </w:pPr>
+      <w:r>
+        <w:t xml:space="preserve">Who did what</w:t>
+      </w:r>
+    </w:p>
+    <w:tbl>
+      <w:tblPr>
+        <w:tblStyle w:val="Table"/>
+        <w:tblW w:type="auto" w:w="0"/>
+        <w:tblLook w:firstRow="1" w:lastRow="0" w:firstColumn="0" w:lastColumn="0" w:noHBand="0" w:noVBand="0" w:val="0020"/>
+      </w:tblPr>
+      <w:tblGrid>
+        <w:gridCol w:w="2640"/>
+        <w:gridCol w:w="2640"/>
+        <w:gridCol w:w="2640"/>
+      </w:tblGrid>
+      <w:tr>
+        <w:trPr>
+          <w:tblHeader w:val="on"/>
+        </w:trPr>
+        <w:tc>
+          <w:tcPr/>
+          <w:p>
+            <w:pPr>
+              <w:pStyle w:val="Compact"/>
+            </w:pPr>
+            <w:r>
+              <w:t xml:space="preserve">Task</w:t>
+            </w:r>
+          </w:p>
+        </w:tc>
+        <w:tc>
+          <w:tcPr/>
+          <w:p>
+            <w:pPr>
+              <w:pStyle w:val="Compact"/>
+            </w:pPr>
+            <w:r>
+              <w:t xml:space="preserve">Author (Abhimanyu Sharotry)</w:t>
+            </w:r>
+          </w:p>
+        </w:tc>
+        <w:tc>
+          <w:tcPr/>
+          <w:p>
+            <w:pPr>
+              <w:pStyle w:val="Compact"/>
+            </w:pPr>
+            <w:r>
+              <w:t xml:space="preserve">AI assistant</w:t>
+            </w:r>
+          </w:p>
+        </w:tc>
+      </w:tr>
+      <w:tr>
+        <w:tc>
+          <w:tcPr/>
+          <w:p>
+            <w:pPr>
+              <w:pStyle w:val="Compact"/>
+            </w:pPr>
+            <w:r>
+              <w:t xml:space="preserve">Scope and working agreement</w:t>
+            </w:r>
+          </w:p>
+        </w:tc>
+        <w:tc>
+          <w:tcPr/>
+          <w:p>
+            <w:pPr>
+              <w:pStyle w:val="Compact"/>
+            </w:pPr>
+            <w:r>
+              <w:t xml:space="preserve">Set the project scope, the phase plan and the working rules (work in small steps, explain before coding, never change a modeling decision silently)</w:t>
+            </w:r>
+          </w:p>
+        </w:tc>
+        <w:tc>
+          <w:tcPr/>
+          <w:p>
+            <w:pPr>
+              <w:pStyle w:val="Compact"/>
+            </w:pPr>
+            <w:r>
+              <w:t xml:space="preserve">Suggested additions to the plan (methodology, open questions), which the author accepted</w:t>
+            </w:r>
+          </w:p>
+        </w:tc>
+      </w:tr>
+      <w:tr>
+        <w:tc>
+          <w:tcPr/>
+          <w:p>
+            <w:pPr>
+              <w:pStyle w:val="Compact"/>
+            </w:pPr>
+            <w:r>
+              <w:t xml:space="preserve">Data</w:t>
+            </w:r>
+          </w:p>
+        </w:tc>
+        <w:tc>
+          <w:tcPr/>
+          <w:p>
+            <w:pPr>
+              <w:pStyle w:val="Compact"/>
+            </w:pPr>
+            <w:r>
+              <w:t xml:space="preserve">Supplied the US Airports, Wiki Conflict and Adolescent Health files; pointed to the Slashdot Zoo and Advogato sources</w:t>
+            </w:r>
+          </w:p>
+        </w:tc>
+        <w:tc>
+          <w:tcPr/>
+          <w:p>
+            <w:pPr>
+              <w:pStyle w:val="Compact"/>
+            </w:pPr>
+            <w:r>
+              <w:t xml:space="preserve">Downloaded the remaining files, recorded checksums, checked original sources (e.g. found that US Airports weights are passengers, not flights) and documented discrepancies</w:t>
+            </w:r>
+          </w:p>
+        </w:tc>
+      </w:tr>
+      <w:tr>
+        <w:tc>
+          <w:tcPr/>
+          <w:p>
+            <w:pPr>
+              <w:pStyle w:val="Compact"/>
+            </w:pPr>
+            <w:r>
+              <w:t xml:space="preserve">Modeling decisions (D1-D6)</w:t>
+            </w:r>
+          </w:p>
+        </w:tc>
+        <w:tc>
+          <w:tcPr/>
+          <w:p>
+            <w:pPr>
+              <w:pStyle w:val="Compact"/>
+            </w:pPr>
+            <w:r>
+              <w:rPr>
+                <w:b/>
+                <w:bCs/>
+              </w:rPr>
+              <w:t xml:space="preserve">Made every decision</w:t>
+            </w:r>
+            <w:r>
+              <w:t xml:space="preserve">, choosing among the options presented (e.g. friends-only for Slashdot Zoo, which differed from the assistant's recommendation)</w:t>
+            </w:r>
+          </w:p>
+        </w:tc>
+        <w:tc>
+          <w:tcPr/>
+          <w:p>
+            <w:pPr>
+              <w:pStyle w:val="Compact"/>
+            </w:pPr>
+            <w:r>
+              <w:t xml:space="preserve">Explored each dataset, laid out the options with pros and cons, and gave a recommendation</w:t>
+            </w:r>
+          </w:p>
+        </w:tc>
+      </w:tr>
+      <w:tr>
+        <w:tc>
+          <w:tcPr/>
+          <w:p>
+            <w:pPr>
+              <w:pStyle w:val="Compact"/>
+            </w:pPr>
+            <w:r>
+              <w:t xml:space="preserve">Study design</w:t>
+            </w:r>
+          </w:p>
+        </w:tc>
+        <w:tc>
+          <w:tcPr/>
+          <w:p>
+            <w:pPr>
+              <w:pStyle w:val="Compact"/>
+            </w:pPr>
+            <w:r>
+              <w:t xml:space="preserve">Chose which runs to perform (all implementations on the small networks, scipy on the large ones, full runs of our own Dijkstra), the order of the work, the density experiment, and the deliverables (GitHub repository, Word report, code)</w:t>
+            </w:r>
+          </w:p>
+        </w:tc>
+        <w:tc>
+          <w:tcPr/>
+          <w:p>
+            <w:pPr>
+              <w:pStyle w:val="Compact"/>
+            </w:pPr>
+            <w:r>
+              <w:t xml:space="preserve">Proposed the measurement method, the feasibility check, the density experiment and time estimates</w:t>
+            </w:r>
+          </w:p>
+        </w:tc>
+      </w:tr>
+      <w:tr>
+        <w:tc>
+          <w:tcPr/>
+          <w:p>
+            <w:pPr>
+              <w:pStyle w:val="Compact"/>
+            </w:pPr>
+            <w:r>
+              <w:t xml:space="preserve">Code</w:t>
+            </w:r>
+          </w:p>
+        </w:tc>
+        <w:tc>
+          <w:tcPr/>
+          <w:p>
+            <w:pPr>
+              <w:pStyle w:val="Compact"/>
+            </w:pPr>
+            <w:r>
+              <w:t xml:space="preserve">Received step-by-step explanations of the code as it was written</w:t>
+            </w:r>
+          </w:p>
+        </w:tc>
+        <w:tc>
+          <w:tcPr/>
+          <w:p>
+            <w:pPr>
+              <w:pStyle w:val="Compact"/>
+            </w:pPr>
+            <w:r>
+              <w:t xml:space="preserve">Wrote all code: the algorithms, data loading and cleaning, the benchmark harness, the scripts and the 402 tests</w:t>
+            </w:r>
+          </w:p>
+        </w:tc>
+      </w:tr>
+      <w:tr>
+        <w:tc>
+          <w:tcPr/>
+          <w:p>
+            <w:pPr>
+              <w:pStyle w:val="Compact"/>
+            </w:pPr>
+            <w:r>
+              <w:t xml:space="preserve">Experiments</w:t>
+            </w:r>
+          </w:p>
+        </w:tc>
+        <w:tc>
+          <w:tcPr/>
+          <w:p>
+            <w:pPr>
+              <w:pStyle w:val="Compact"/>
+            </w:pPr>
+            <w:r>
+              <w:t xml:space="preserve">Approved the run plans</w:t>
+            </w:r>
+          </w:p>
+        </w:tc>
+        <w:tc>
+          <w:tcPr/>
+          <w:p>
+            <w:pPr>
+              <w:pStyle w:val="Compact"/>
+            </w:pPr>
+            <w:r>
+              <w:t xml:space="preserve">Ran all benchmarks and experiments on the author's computer</w:t>
+            </w:r>
+          </w:p>
+        </w:tc>
+      </w:tr>
+      <w:tr>
+        <w:tc>
+          <w:tcPr/>
+          <w:p>
+            <w:pPr>
+              <w:pStyle w:val="Compact"/>
+            </w:pPr>
+            <w:r>
+              <w:t xml:space="preserve">Analysis and report</w:t>
+            </w:r>
+          </w:p>
+        </w:tc>
+        <w:tc>
+          <w:tcPr/>
+          <w:p>
+            <w:pPr>
+              <w:pStyle w:val="Compact"/>
+            </w:pPr>
+            <w:r>
+              <w:t xml:space="preserve">Requested specific content (listing every non-textbook algorithm variant, the assumptions section, this disclosure) and asked for a verification pass</w:t>
+            </w:r>
+          </w:p>
+        </w:tc>
+        <w:tc>
+          <w:tcPr/>
+          <w:p>
+            <w:pPr>
+              <w:pStyle w:val="Compact"/>
+            </w:pPr>
+            <w:r>
+              <w:t xml:space="preserve">Produced the tables and figures, drafted the report and the decision log, and carried out the verification pass, correcting the errors it found</w:t>
+            </w:r>
+          </w:p>
+        </w:tc>
+      </w:tr>
+    </w:tbl>
+    <w:bookmarkEnd w:id="49"/>
+    <w:bookmarkStart w:id="50" w:name="how-the-ai-output-was-checked"/>
+    <w:p>
+      <w:pPr>
+        <w:pStyle w:val="Heading2"/>
+      </w:pPr>
+      <w:r>
+        <w:t xml:space="preserve">How the AI output was checked</w:t>
+      </w:r>
+    </w:p>
+    <w:p>
+      <w:pPr>
+        <w:pStyle w:val="Compact"/>
+        <w:numPr>
+          <w:ilvl w:val="0"/>
+          <w:numId w:val="1012"/>
+        </w:numPr>
+      </w:pPr>
+      <w:r>
+        <w:rPr>
+          <w:b/>
+          <w:bCs/>
+        </w:rPr>
+        <w:t xml:space="preserve">Code:</w:t>
+      </w:r>
+      <w:r>
+        <w:t xml:space="preserve"> </w:t>
+      </w:r>
+      <w:r>
+        <w:t xml:space="preserve">every implementation is tested against an independent reference (networkx), and all</w:t>
+      </w:r>
+      <w:r>
+        <w:t xml:space="preserve"> </w:t>
+      </w:r>
+      <w:r>
+        <w:t xml:space="preserve">versions had to agree on every dataset (Section 4.3).</w:t>
+      </w:r>
+    </w:p>
+    <w:p>
+      <w:pPr>
+        <w:pStyle w:val="Compact"/>
+        <w:numPr>
+          <w:ilvl w:val="0"/>
+          <w:numId w:val="1012"/>
+        </w:numPr>
+      </w:pPr>
+      <w:r>
+        <w:rPr>
+          <w:b/>
+          <w:bCs/>
+        </w:rPr>
+        <w:t xml:space="preserve">Numbers in this report:</w:t>
+      </w:r>
+      <w:r>
+        <w:t xml:space="preserve"> </w:t>
+      </w:r>
+      <w:r>
+        <w:t xml:space="preserve">recomputed from the raw result files during a verification pass;</w:t>
+      </w:r>
+      <w:r>
+        <w:t xml:space="preserve"> </w:t>
+      </w:r>
+      <w:r>
+        <w:t xml:space="preserve">errors found in earlier drafts were corrected (listed in the Git history).</w:t>
+      </w:r>
+    </w:p>
+    <w:p>
+      <w:pPr>
+        <w:pStyle w:val="Compact"/>
+        <w:numPr>
+          <w:ilvl w:val="0"/>
+          <w:numId w:val="1012"/>
+        </w:numPr>
+      </w:pPr>
+      <w:r>
+        <w:rPr>
+          <w:b/>
+          <w:bCs/>
+        </w:rPr>
+        <w:t xml:space="preserve">Claims about the data:</w:t>
+      </w:r>
+      <w:r>
+        <w:t xml:space="preserve"> </w:t>
+      </w:r>
+      <w:r>
+        <w:t xml:space="preserve">checked against the original data sources where available; claims</w:t>
+      </w:r>
+      <w:r>
+        <w:t xml:space="preserve"> </w:t>
+      </w:r>
+      <w:r>
+        <w:t xml:space="preserve">that could not be confirmed are labelled as inferences (Section 9).</w:t>
+      </w:r>
+    </w:p>
+    <w:p>
+      <w:pPr>
+        <w:pStyle w:val="FirstParagraph"/>
+      </w:pPr>
+      <w:r>
+        <w:t xml:space="preserve">The explanations of the algorithms, the decisions and the results were discussed with the author</w:t>
+      </w:r>
+      <w:r>
+        <w:t xml:space="preserve"> </w:t>
+      </w:r>
+      <w:r>
+        <w:t xml:space="preserve">step by step during the work.</w:t>
+      </w:r>
+    </w:p>
+    <w:bookmarkEnd w:id="50"/>
+    <w:bookmarkEnd w:id="51"/>
     <w:sectPr>
       <w:footnotePr>
         <w:numRestart w:val="eachSect"/>
@@ -7483,6 +8044,9 @@
     <w:abstractNumId w:val="991"/>
   </w:num>
   <w:num w:numId="1011">
+    <w:abstractNumId w:val="991"/>
+  </w:num>
+  <w:num w:numId="1012">
     <w:abstractNumId w:val="991"/>
   </w:num>
 </w:numbering>

</xml_diff>

<commit_message>
Report Section 12: scale of AI use (model, tokens, messages, code size, compute)
Figures read from the Claude Code session transcript: claude-opus-5-5 only,
304 responses, 350,154 output tokens, ~87.5M input tokens (86.0M cache reads),
~40 author messages, ~2,600 lines of Python, ~10 h of experiment compute.

Co-Authored-By: Claude Opus 5.5 <noreply@anthropic.com>
</commit_message>
<xml_diff>
--- a/computational-study-1-apsp/docs/comparison_report.docx
+++ b/computational-study-1-apsp/docs/comparison_report.docx
@@ -7254,7 +7254,7 @@
       </w:r>
     </w:p>
     <w:bookmarkEnd w:id="48"/>
-    <w:bookmarkStart w:id="51" w:name="X31c0c3c89954e4a8a93d1d2e94aae256af75ef1"/>
+    <w:bookmarkStart w:id="52" w:name="X31c0c3c89954e4a8a93d1d2e94aae256af75ef1"/>
     <w:p>
       <w:pPr>
         <w:pStyle w:val="Heading1"/>
@@ -7688,7 +7688,438 @@
       </w:tr>
     </w:tbl>
     <w:bookmarkEnd w:id="49"/>
-    <w:bookmarkStart w:id="50" w:name="how-the-ai-output-was-checked"/>
+    <w:bookmarkStart w:id="50" w:name="scale-of-the-ai-assisted-work"/>
+    <w:p>
+      <w:pPr>
+        <w:pStyle w:val="Heading2"/>
+      </w:pPr>
+      <w:r>
+        <w:t xml:space="preserve">Scale of the AI-assisted work</w:t>
+      </w:r>
+    </w:p>
+    <w:p>
+      <w:pPr>
+        <w:pStyle w:val="FirstParagraph"/>
+      </w:pPr>
+      <w:r>
+        <w:t xml:space="preserve">To help readers judge how much work such a study takes with an AI assistant. Figures come from the</w:t>
+      </w:r>
+      <w:r>
+        <w:t xml:space="preserve"> </w:t>
+      </w:r>
+      <w:r>
+        <w:t xml:space="preserve">Claude Code session transcript saved on the author's computer, up to October 13, 2026, 9:16 PM</w:t>
+      </w:r>
+      <w:r>
+        <w:t xml:space="preserve"> </w:t>
+      </w:r>
+      <w:r>
+        <w:t xml:space="preserve">(US Central); the final edits to this section add slightly more.</w:t>
+      </w:r>
+    </w:p>
+    <w:tbl>
+      <w:tblPr>
+        <w:tblStyle w:val="Table"/>
+        <w:tblW w:type="auto" w:w="0"/>
+        <w:tblLook w:firstRow="1" w:lastRow="0" w:firstColumn="0" w:lastColumn="0" w:noHBand="0" w:noVBand="0" w:val="0020"/>
+      </w:tblPr>
+      <w:tblGrid>
+        <w:gridCol w:w="3960"/>
+        <w:gridCol w:w="3960"/>
+      </w:tblGrid>
+      <w:tr>
+        <w:trPr>
+          <w:tblHeader w:val="on"/>
+        </w:trPr>
+        <w:tc>
+          <w:tcPr/>
+          <w:p>
+            <w:pPr>
+              <w:pStyle w:val="Compact"/>
+            </w:pPr>
+            <w:r>
+              <w:t xml:space="preserve">Measure</w:t>
+            </w:r>
+          </w:p>
+        </w:tc>
+        <w:tc>
+          <w:tcPr/>
+          <w:p>
+            <w:pPr>
+              <w:pStyle w:val="Compact"/>
+            </w:pPr>
+            <w:r>
+              <w:t xml:space="preserve">Value</w:t>
+            </w:r>
+          </w:p>
+        </w:tc>
+      </w:tr>
+      <w:tr>
+        <w:tc>
+          <w:tcPr/>
+          <w:p>
+            <w:pPr>
+              <w:pStyle w:val="Compact"/>
+            </w:pPr>
+            <w:r>
+              <w:t xml:space="preserve">Model</w:t>
+            </w:r>
+          </w:p>
+        </w:tc>
+        <w:tc>
+          <w:tcPr/>
+          <w:p>
+            <w:pPr>
+              <w:pStyle w:val="Compact"/>
+            </w:pPr>
+            <w:r>
+              <w:t xml:space="preserve">Claude Opus 5.5 (</w:t>
+            </w:r>
+            <w:r>
+              <w:rPr>
+                <w:rStyle w:val="VerbatimChar"/>
+              </w:rPr>
+              <w:t xml:space="preserve">claude-opus-5-5</w:t>
+            </w:r>
+            <w:r>
+              <w:t xml:space="preserve">), Anthropic; the only model used, no sub-agents</w:t>
+            </w:r>
+          </w:p>
+        </w:tc>
+      </w:tr>
+      <w:tr>
+        <w:tc>
+          <w:tcPr/>
+          <w:p>
+            <w:pPr>
+              <w:pStyle w:val="Compact"/>
+            </w:pPr>
+            <w:r>
+              <w:t xml:space="preserve">Tool</w:t>
+            </w:r>
+          </w:p>
+        </w:tc>
+        <w:tc>
+          <w:tcPr/>
+          <w:p>
+            <w:pPr>
+              <w:pStyle w:val="Compact"/>
+            </w:pPr>
+            <w:r>
+              <w:t xml:space="preserve">Claude Code (VS Code extension), one continuous session</w:t>
+            </w:r>
+          </w:p>
+        </w:tc>
+      </w:tr>
+      <w:tr>
+        <w:tc>
+          <w:tcPr/>
+          <w:p>
+            <w:pPr>
+              <w:pStyle w:val="Compact"/>
+            </w:pPr>
+            <w:r>
+              <w:t xml:space="preserve">Calendar time</w:t>
+            </w:r>
+          </w:p>
+        </w:tc>
+        <w:tc>
+          <w:tcPr/>
+          <w:p>
+            <w:pPr>
+              <w:pStyle w:val="Compact"/>
+            </w:pPr>
+            <w:r>
+              <w:t xml:space="preserve">October 12, 6:47 PM to October 13, 9:16 PM (US Central), including an overnight break</w:t>
+            </w:r>
+          </w:p>
+        </w:tc>
+      </w:tr>
+      <w:tr>
+        <w:tc>
+          <w:tcPr/>
+          <w:p>
+            <w:pPr>
+              <w:pStyle w:val="Compact"/>
+            </w:pPr>
+            <w:r>
+              <w:t xml:space="preserve">Messages typed by the author</w:t>
+            </w:r>
+          </w:p>
+        </w:tc>
+        <w:tc>
+          <w:tcPr/>
+          <w:p>
+            <w:pPr>
+              <w:pStyle w:val="Compact"/>
+            </w:pPr>
+            <w:r>
+              <w:t xml:space="preserve">about 40 (instructions, decisions, questions)</w:t>
+            </w:r>
+          </w:p>
+        </w:tc>
+      </w:tr>
+      <w:tr>
+        <w:tc>
+          <w:tcPr/>
+          <w:p>
+            <w:pPr>
+              <w:pStyle w:val="Compact"/>
+            </w:pPr>
+            <w:r>
+              <w:t xml:space="preserve">Model responses</w:t>
+            </w:r>
+          </w:p>
+        </w:tc>
+        <w:tc>
+          <w:tcPr/>
+          <w:p>
+            <w:pPr>
+              <w:pStyle w:val="Compact"/>
+            </w:pPr>
+            <w:r>
+              <w:t xml:space="preserve">304</w:t>
+            </w:r>
+          </w:p>
+        </w:tc>
+      </w:tr>
+      <w:tr>
+        <w:tc>
+          <w:tcPr/>
+          <w:p>
+            <w:pPr>
+              <w:pStyle w:val="Compact"/>
+            </w:pPr>
+            <w:r>
+              <w:t xml:space="preserve">Output tokens (text, code and reasoning generated by the model)</w:t>
+            </w:r>
+          </w:p>
+        </w:tc>
+        <w:tc>
+          <w:tcPr/>
+          <w:p>
+            <w:pPr>
+              <w:pStyle w:val="Compact"/>
+            </w:pPr>
+            <w:r>
+              <w:t xml:space="preserve">350,154</w:t>
+            </w:r>
+          </w:p>
+        </w:tc>
+      </w:tr>
+      <w:tr>
+        <w:tc>
+          <w:tcPr/>
+          <w:p>
+            <w:pPr>
+              <w:pStyle w:val="Compact"/>
+            </w:pPr>
+            <w:r>
+              <w:t xml:space="preserve">Input tokens processed</w:t>
+            </w:r>
+          </w:p>
+        </w:tc>
+        <w:tc>
+          <w:tcPr/>
+          <w:p>
+            <w:pPr>
+              <w:pStyle w:val="Compact"/>
+            </w:pPr>
+            <w:r>
+              <w:t xml:space="preserve">about 87.5 million, of which 86.0 million were re-reads of the conversation from cache (each response re-reads the whole conversation so far) and 1.5 million were new</w:t>
+            </w:r>
+          </w:p>
+        </w:tc>
+      </w:tr>
+      <w:tr>
+        <w:tc>
+          <w:tcPr/>
+          <w:p>
+            <w:pPr>
+              <w:pStyle w:val="Compact"/>
+            </w:pPr>
+            <w:r>
+              <w:t xml:space="preserve">Code written</w:t>
+            </w:r>
+          </w:p>
+        </w:tc>
+        <w:tc>
+          <w:tcPr/>
+          <w:p>
+            <w:pPr>
+              <w:pStyle w:val="Compact"/>
+            </w:pPr>
+            <w:r>
+              <w:t xml:space="preserve">about 2,600 lines of Python (1,004 in</w:t>
+            </w:r>
+            <w:r>
+              <w:t xml:space="preserve"> </w:t>
+            </w:r>
+            <w:r>
+              <w:rPr>
+                <w:rStyle w:val="VerbatimChar"/>
+              </w:rPr>
+              <w:t xml:space="preserve">src/</w:t>
+            </w:r>
+            <w:r>
+              <w:t xml:space="preserve">, 638 in</w:t>
+            </w:r>
+            <w:r>
+              <w:t xml:space="preserve"> </w:t>
+            </w:r>
+            <w:r>
+              <w:rPr>
+                <w:rStyle w:val="VerbatimChar"/>
+              </w:rPr>
+              <w:t xml:space="preserve">tests/</w:t>
+            </w:r>
+            <w:r>
+              <w:t xml:space="preserve">, 950 in</w:t>
+            </w:r>
+            <w:r>
+              <w:t xml:space="preserve"> </w:t>
+            </w:r>
+            <w:r>
+              <w:rPr>
+                <w:rStyle w:val="VerbatimChar"/>
+              </w:rPr>
+              <w:t xml:space="preserve">scripts/</w:t>
+            </w:r>
+            <w:r>
+              <w:t xml:space="preserve">)</w:t>
+            </w:r>
+          </w:p>
+        </w:tc>
+      </w:tr>
+      <w:tr>
+        <w:tc>
+          <w:tcPr/>
+          <w:p>
+            <w:pPr>
+              <w:pStyle w:val="Compact"/>
+            </w:pPr>
+            <w:r>
+              <w:t xml:space="preserve">Documentation written</w:t>
+            </w:r>
+          </w:p>
+        </w:tc>
+        <w:tc>
+          <w:tcPr/>
+          <w:p>
+            <w:pPr>
+              <w:pStyle w:val="Compact"/>
+            </w:pPr>
+            <w:r>
+              <w:t xml:space="preserve">about 900 lines (this report,</w:t>
+            </w:r>
+            <w:r>
+              <w:t xml:space="preserve"> </w:t>
+            </w:r>
+            <w:r>
+              <w:rPr>
+                <w:rStyle w:val="VerbatimChar"/>
+              </w:rPr>
+              <w:t xml:space="preserve">docs/decisions.md</w:t>
+            </w:r>
+            <w:r>
+              <w:t xml:space="preserve">,</w:t>
+            </w:r>
+            <w:r>
+              <w:t xml:space="preserve"> </w:t>
+            </w:r>
+            <w:r>
+              <w:rPr>
+                <w:rStyle w:val="VerbatimChar"/>
+              </w:rPr>
+              <w:t xml:space="preserve">data/SOURCES.md</w:t>
+            </w:r>
+            <w:r>
+              <w:t xml:space="preserve">)</w:t>
+            </w:r>
+          </w:p>
+        </w:tc>
+      </w:tr>
+      <w:tr>
+        <w:tc>
+          <w:tcPr/>
+          <w:p>
+            <w:pPr>
+              <w:pStyle w:val="Compact"/>
+            </w:pPr>
+            <w:r>
+              <w:t xml:space="preserve">Git commits</w:t>
+            </w:r>
+          </w:p>
+        </w:tc>
+        <w:tc>
+          <w:tcPr/>
+          <w:p>
+            <w:pPr>
+              <w:pStyle w:val="Compact"/>
+            </w:pPr>
+            <w:r>
+              <w:t xml:space="preserve">26 (25 made by the assistant)</w:t>
+            </w:r>
+          </w:p>
+        </w:tc>
+      </w:tr>
+      <w:tr>
+        <w:tc>
+          <w:tcPr/>
+          <w:p>
+            <w:pPr>
+              <w:pStyle w:val="Compact"/>
+            </w:pPr>
+            <w:r>
+              <w:t xml:space="preserve">Computer time for the experiments</w:t>
+            </w:r>
+          </w:p>
+        </w:tc>
+        <w:tc>
+          <w:tcPr/>
+          <w:p>
+            <w:pPr>
+              <w:pStyle w:val="Compact"/>
+            </w:pPr>
+            <w:r>
+              <w:t xml:space="preserve">about 10 hours on one CPU core, of which 8.0 hours was the full pure-Python Dijkstra run on Wiki Conflict</w:t>
+            </w:r>
+          </w:p>
+        </w:tc>
+      </w:tr>
+    </w:tbl>
+    <w:p>
+      <w:pPr>
+        <w:pStyle w:val="BodyText"/>
+      </w:pPr>
+      <w:r>
+        <w:t xml:space="preserve">A</w:t>
+      </w:r>
+      <w:r>
+        <w:t xml:space="preserve"> </w:t>
+      </w:r>
+      <w:r>
+        <w:rPr>
+          <w:i/>
+          <w:iCs/>
+        </w:rPr>
+        <w:t xml:space="preserve">token</w:t>
+      </w:r>
+      <w:r>
+        <w:t xml:space="preserve"> </w:t>
+      </w:r>
+      <w:r>
+        <w:t xml:space="preserve">is a small piece of text, roughly three-quarters of an English word. Monetary cost is not</w:t>
+      </w:r>
+      <w:r>
+        <w:t xml:space="preserve"> </w:t>
+      </w:r>
+      <w:r>
+        <w:t xml:space="preserve">reported because it depends on the pricing plan.</w:t>
+      </w:r>
+    </w:p>
+    <w:bookmarkEnd w:id="50"/>
+    <w:bookmarkStart w:id="51" w:name="how-the-ai-output-was-checked"/>
     <w:p>
       <w:pPr>
         <w:pStyle w:val="Heading2"/>
@@ -7795,8 +8226,8 @@
         <w:t xml:space="preserve">step by step during the work.</w:t>
       </w:r>
     </w:p>
-    <w:bookmarkEnd w:id="50"/>
     <w:bookmarkEnd w:id="51"/>
+    <w:bookmarkEnd w:id="52"/>
     <w:sectPr>
       <w:footnotePr>
         <w:numRestart w:val="eachSect"/>

</xml_diff>

<commit_message>
Report: full machine description and hardware caveats
MacBook Air 15-inch M2 (2023, Mac14,15), 8 cores (4P+4E), 24 GB, macOS 26.7.1
build 25G241; caveats: fanless (possible thermal throttling on hours-long runs)
and uncontrolled performance/efficiency core placement.

Co-Authored-By: Claude Opus 5.5 <noreply@anthropic.com>
</commit_message>
<xml_diff>
--- a/computational-study-1-apsp/docs/comparison_report.docx
+++ b/computational-study-1-apsp/docs/comparison_report.docx
@@ -2544,7 +2544,65 @@
         </w:numPr>
       </w:pPr>
       <w:r>
-        <w:t xml:space="preserve">Machine: Apple M2, 24 GiB RAM, macOS 26.7.1; Python 3.11.8, numpy 2.4.6, scipy 1.17.1.</w:t>
+        <w:rPr>
+          <w:b/>
+          <w:bCs/>
+        </w:rPr>
+        <w:t xml:space="preserve">Machine:</w:t>
+      </w:r>
+      <w:r>
+        <w:t xml:space="preserve"> </w:t>
+      </w:r>
+      <w:r>
+        <w:t xml:space="preserve">MacBook Air (15-inch, M2, 2023; model identifier Mac14,15). Apple M2 chip with 8 CPU</w:t>
+      </w:r>
+      <w:r>
+        <w:t xml:space="preserve"> </w:t>
+      </w:r>
+      <w:r>
+        <w:t xml:space="preserve">cores (4 performance, 4 efficiency) and 24 GB of unified memory; macOS 26.7.1 (build 25G241).</w:t>
+      </w:r>
+      <w:r>
+        <w:t xml:space="preserve"> </w:t>
+      </w:r>
+      <w:r>
+        <w:t xml:space="preserve">Software: Python 3.11.8, numpy 2.4.6, scipy 1.17.1, networkx 3.6.1. Every run used a single</w:t>
+      </w:r>
+      <w:r>
+        <w:t xml:space="preserve"> </w:t>
+      </w:r>
+      <w:r>
+        <w:t xml:space="preserve">core; the computer was kept awake (</w:t>
+      </w:r>
+      <w:r>
+        <w:rPr>
+          <w:rStyle w:val="VerbatimChar"/>
+        </w:rPr>
+        <w:t xml:space="preserve">caffeinate</w:t>
+      </w:r>
+      <w:r>
+        <w:t xml:space="preserve">) and not used for other heavy work during runs.</w:t>
+      </w:r>
+      <w:r>
+        <w:t xml:space="preserve"> </w:t>
+      </w:r>
+      <w:r>
+        <w:t xml:space="preserve">Each row of</w:t>
+      </w:r>
+      <w:r>
+        <w:t xml:space="preserve"> </w:t>
+      </w:r>
+      <w:r>
+        <w:rPr>
+          <w:rStyle w:val="VerbatimChar"/>
+        </w:rPr>
+        <w:t xml:space="preserve">results/benchmarks.csv</w:t>
+      </w:r>
+      <w:r>
+        <w:t xml:space="preserve"> </w:t>
+      </w:r>
+      <w:r>
+        <w:t xml:space="preserve">records the machine and library versions.</w:t>
       </w:r>
     </w:p>
     <w:bookmarkEnd w:id="17"/>
@@ -6811,18 +6869,18 @@
               <w:pStyle w:val="Compact"/>
             </w:pPr>
             <w:r>
-              <w:t xml:space="preserve">One machine, single thread. Long runs (over 10 s) were measured once.</w:t>
-            </w:r>
-          </w:p>
-        </w:tc>
-        <w:tc>
-          <w:tcPr/>
-          <w:p>
-            <w:pPr>
-              <w:pStyle w:val="Compact"/>
-            </w:pPr>
-            <w:r>
-              <w:t xml:space="preserve">Absolute times would differ on other hardware; single long runs carry some timing noise.</w:t>
+              <w:t xml:space="preserve">One machine (MacBook Air, M2), single thread. Long runs (over 10 s) were measured once.</w:t>
+            </w:r>
+          </w:p>
+        </w:tc>
+        <w:tc>
+          <w:tcPr/>
+          <w:p>
+            <w:pPr>
+              <w:pStyle w:val="Compact"/>
+            </w:pPr>
+            <w:r>
+              <w:t xml:space="preserve">Absolute times would differ on other hardware; single long runs carry some timing noise. The MacBook Air has no fan, so hours-long runs (e.g. the 8-hour Wiki Conflict run) may have been slowed slightly by thermal throttling. macOS chooses whether a job runs on a performance or an efficiency core; this was not controlled.</w:t>
             </w:r>
           </w:p>
         </w:tc>
@@ -6883,13 +6941,13 @@
         </w:numPr>
       </w:pPr>
       <w:r>
-        <w:t xml:space="preserve">Results are from one machine (Apple M2, single thread); absolute times will differ elsewhere, but</w:t>
-      </w:r>
-      <w:r>
-        <w:t xml:space="preserve"> </w:t>
-      </w:r>
-      <w:r>
-        <w:t xml:space="preserve">the ratios and the complexity arguments do not depend on the machine.</w:t>
+        <w:t xml:space="preserve">Results are from one machine (MacBook Air, Apple M2, single thread, fanless); absolute times will</w:t>
+      </w:r>
+      <w:r>
+        <w:t xml:space="preserve"> </w:t>
+      </w:r>
+      <w:r>
+        <w:t xml:space="preserve">differ elsewhere, but the ratios and the complexity arguments do not depend on the machine.</w:t>
       </w:r>
     </w:p>
     <w:bookmarkEnd w:id="45"/>
@@ -8082,7 +8140,7 @@
               <w:pStyle w:val="Compact"/>
             </w:pPr>
             <w:r>
-              <w:t xml:space="preserve">about 10 hours on one CPU core, of which 8.0 hours was the full pure-Python Dijkstra run on Wiki Conflict</w:t>
+              <w:t xml:space="preserve">about 10 hours on one CPU core of the MacBook Air (M2) described in Section 3.2, of which 8.0 hours was the full pure-Python Dijkstra run on Wiki Conflict</w:t>
             </w:r>
           </w:p>
         </w:tc>

</xml_diff>